<commit_message>
Working version of Croptimal for Angola data.
</commit_message>
<xml_diff>
--- a/Croptimal/03_Python_Scripts/README_LS_SCRIPTS.docx
+++ b/Croptimal/03_Python_Scripts/README_LS_SCRIPTS.docx
@@ -1,6 +1,6 @@
 
 <file path=word/document.xml><?xml version="1.0" encoding="utf-8"?>
-<w:document xmlns:wpc="http://schemas.microsoft.com/office/word/2010/wordprocessingCanvas" xmlns:cx="http://schemas.microsoft.com/office/drawing/2014/chartex" xmlns:cx1="http://schemas.microsoft.com/office/drawing/2015/9/8/chartex" xmlns:cx2="http://schemas.microsoft.com/office/drawing/2015/10/21/chartex" xmlns:cx3="http://schemas.microsoft.com/office/drawing/2016/5/9/chartex" xmlns:cx4="http://schemas.microsoft.com/office/drawing/2016/5/10/chartex" xmlns:cx5="http://schemas.microsoft.com/office/drawing/2016/5/11/chartex" xmlns:cx6="http://schemas.microsoft.com/office/drawing/2016/5/12/chartex" xmlns:cx7="http://schemas.microsoft.com/office/drawing/2016/5/13/chartex" xmlns:cx8="http://schemas.microsoft.com/office/drawing/2016/5/14/chartex" xmlns:mc="http://schemas.openxmlformats.org/markup-compatibility/2006" xmlns:aink="http://schemas.microsoft.com/office/drawing/2016/ink" xmlns:am3d="http://schemas.microsoft.com/office/drawing/2017/model3d" xmlns:o="urn:schemas-microsoft-com:office:office" xmlns:r="http://schemas.openxmlformats.org/officeDocument/2006/relationships" xmlns:m="http://schemas.openxmlformats.org/officeDocument/2006/math" xmlns:v="urn:schemas-microsoft-com:vml" xmlns:wp14="http://schemas.microsoft.com/office/word/2010/wordprocessingDrawing" xmlns:wp="http://schemas.openxmlformats.org/drawingml/2006/wordprocessingDrawing" xmlns:w10="urn:schemas-microsoft-com:office:word" xmlns:w="http://schemas.openxmlformats.org/wordprocessingml/2006/main" xmlns:w14="http://schemas.microsoft.com/office/word/2010/wordml" xmlns:w15="http://schemas.microsoft.com/office/word/2012/wordml" xmlns:w16cex="http://schemas.microsoft.com/office/word/2018/wordml/cex" xmlns:w16cid="http://schemas.microsoft.com/office/word/2016/wordml/cid" xmlns:w16="http://schemas.microsoft.com/office/word/2018/wordml" xmlns:w16sdtdh="http://schemas.microsoft.com/office/word/2020/wordml/sdtdatahash" xmlns:w16se="http://schemas.microsoft.com/office/word/2015/wordml/symex" xmlns:wpg="http://schemas.microsoft.com/office/word/2010/wordprocessingGroup" xmlns:wpi="http://schemas.microsoft.com/office/word/2010/wordprocessingInk" xmlns:wne="http://schemas.microsoft.com/office/word/2006/wordml" xmlns:wps="http://schemas.microsoft.com/office/word/2010/wordprocessingShape" mc:Ignorable="w14 w15 w16se w16cid w16 w16cex w16sdtdh wp14">
+<w:document xmlns:wpc="http://schemas.microsoft.com/office/word/2010/wordprocessingCanvas" xmlns:cx="http://schemas.microsoft.com/office/drawing/2014/chartex" xmlns:cx1="http://schemas.microsoft.com/office/drawing/2015/9/8/chartex" xmlns:cx2="http://schemas.microsoft.com/office/drawing/2015/10/21/chartex" xmlns:cx3="http://schemas.microsoft.com/office/drawing/2016/5/9/chartex" xmlns:cx4="http://schemas.microsoft.com/office/drawing/2016/5/10/chartex" xmlns:cx5="http://schemas.microsoft.com/office/drawing/2016/5/11/chartex" xmlns:cx6="http://schemas.microsoft.com/office/drawing/2016/5/12/chartex" xmlns:cx7="http://schemas.microsoft.com/office/drawing/2016/5/13/chartex" xmlns:cx8="http://schemas.microsoft.com/office/drawing/2016/5/14/chartex" xmlns:mc="http://schemas.openxmlformats.org/markup-compatibility/2006" xmlns:aink="http://schemas.microsoft.com/office/drawing/2016/ink" xmlns:am3d="http://schemas.microsoft.com/office/drawing/2017/model3d" xmlns:o="urn:schemas-microsoft-com:office:office" xmlns:oel="http://schemas.microsoft.com/office/2019/extlst" xmlns:r="http://schemas.openxmlformats.org/officeDocument/2006/relationships" xmlns:m="http://schemas.openxmlformats.org/officeDocument/2006/math" xmlns:v="urn:schemas-microsoft-com:vml" xmlns:wp14="http://schemas.microsoft.com/office/word/2010/wordprocessingDrawing" xmlns:wp="http://schemas.openxmlformats.org/drawingml/2006/wordprocessingDrawing" xmlns:w10="urn:schemas-microsoft-com:office:word" xmlns:w="http://schemas.openxmlformats.org/wordprocessingml/2006/main" xmlns:w14="http://schemas.microsoft.com/office/word/2010/wordml" xmlns:w15="http://schemas.microsoft.com/office/word/2012/wordml" xmlns:w16cex="http://schemas.microsoft.com/office/word/2018/wordml/cex" xmlns:w16cid="http://schemas.microsoft.com/office/word/2016/wordml/cid" xmlns:w16="http://schemas.microsoft.com/office/word/2018/wordml" xmlns:w16du="http://schemas.microsoft.com/office/word/2023/wordml/word16du" xmlns:w16sdtdh="http://schemas.microsoft.com/office/word/2020/wordml/sdtdatahash" xmlns:w16sdtfl="http://schemas.microsoft.com/office/word/2024/wordml/sdtformatlock" xmlns:w16se="http://schemas.microsoft.com/office/word/2015/wordml/symex" xmlns:wpg="http://schemas.microsoft.com/office/word/2010/wordprocessingGroup" xmlns:wpi="http://schemas.microsoft.com/office/word/2010/wordprocessingInk" xmlns:wne="http://schemas.microsoft.com/office/word/2006/wordml" xmlns:wps="http://schemas.microsoft.com/office/word/2010/wordprocessingShape" mc:Ignorable="w14 w15 w16se w16cid w16 w16cex w16sdtdh w16sdtfl w16du wp14">
   <w:background w:color="FFFFFF" w:themeColor="background1"/>
   <w:body>
     <w:p>
@@ -22,6 +22,20 @@
       <w:bookmarkStart w:id="1" w:name="_Toc26964512"/>
       <w:bookmarkStart w:id="2" w:name="_Toc26964608"/>
       <w:bookmarkStart w:id="3" w:name="_Toc26965112"/>
+      <w:r>
+        <w:rPr>
+          <w:rStyle w:val="Hyperlink"/>
+          <w:rFonts w:ascii="Century Gothic" w:hAnsi="Century Gothic"/>
+          <w:b/>
+          <w:bCs/>
+          <w:color w:val="003268"/>
+          <w:sz w:val="32"/>
+          <w:szCs w:val="40"/>
+          <w:u w:val="none"/>
+          <w:lang w:val="en-GB"/>
+        </w:rPr>
+        <w:t>//</w:t>
+      </w:r>
       <w:r>
         <w:rPr>
           <w:rStyle w:val="Hyperlink"/>
@@ -445,7 +459,7 @@
                 <w:rFonts w:ascii="Calibri" w:hAnsi="Calibri" w:cs="Calibri"/>
                 <w:sz w:val="16"/>
                 <w:szCs w:val="16"/>
-                <w:lang w:eastAsia="en-NL"/>
+                <w:lang/>
               </w:rPr>
             </w:pPr>
             <w:r>
@@ -453,7 +467,7 @@
                 <w:rFonts w:ascii="Calibri" w:hAnsi="Calibri" w:cs="Calibri"/>
                 <w:sz w:val="16"/>
                 <w:szCs w:val="16"/>
-                <w:lang w:eastAsia="en-NL"/>
+                <w:lang/>
               </w:rPr>
               <w:t>Parameter</w:t>
             </w:r>
@@ -472,7 +486,7 @@
                 <w:rFonts w:ascii="Calibri" w:hAnsi="Calibri" w:cs="Calibri"/>
                 <w:sz w:val="16"/>
                 <w:szCs w:val="16"/>
-                <w:lang w:eastAsia="en-NL"/>
+                <w:lang/>
               </w:rPr>
             </w:pPr>
             <w:r>
@@ -480,7 +494,7 @@
                 <w:rFonts w:ascii="Calibri" w:hAnsi="Calibri" w:cs="Calibri"/>
                 <w:sz w:val="16"/>
                 <w:szCs w:val="16"/>
-                <w:lang w:eastAsia="en-NL"/>
+                <w:lang/>
               </w:rPr>
               <w:t>Source</w:t>
             </w:r>
@@ -499,7 +513,7 @@
                 <w:rFonts w:ascii="Calibri" w:hAnsi="Calibri" w:cs="Calibri"/>
                 <w:sz w:val="16"/>
                 <w:szCs w:val="16"/>
-                <w:lang w:eastAsia="en-NL"/>
+                <w:lang/>
               </w:rPr>
             </w:pPr>
             <w:r>
@@ -507,7 +521,7 @@
                 <w:rFonts w:ascii="Calibri" w:hAnsi="Calibri" w:cs="Calibri"/>
                 <w:sz w:val="16"/>
                 <w:szCs w:val="16"/>
-                <w:lang w:eastAsia="en-NL"/>
+                <w:lang/>
               </w:rPr>
               <w:t>link</w:t>
             </w:r>
@@ -527,7 +541,7 @@
                 <w:b w:val="0"/>
                 <w:sz w:val="16"/>
                 <w:szCs w:val="16"/>
-                <w:lang w:eastAsia="en-NL"/>
+                <w:lang/>
               </w:rPr>
             </w:pPr>
             <w:r>
@@ -535,7 +549,7 @@
                 <w:rFonts w:ascii="Calibri" w:hAnsi="Calibri" w:cs="Calibri"/>
                 <w:sz w:val="16"/>
                 <w:szCs w:val="16"/>
-                <w:lang w:eastAsia="en-NL"/>
+                <w:lang/>
               </w:rPr>
               <w:t>Spat. Res.</w:t>
             </w:r>
@@ -547,7 +561,7 @@
                 <w:rFonts w:ascii="Calibri" w:hAnsi="Calibri" w:cs="Calibri"/>
                 <w:sz w:val="16"/>
                 <w:szCs w:val="16"/>
-                <w:lang w:eastAsia="en-NL"/>
+                <w:lang/>
               </w:rPr>
             </w:pPr>
             <w:r>
@@ -555,7 +569,7 @@
                 <w:rFonts w:ascii="Calibri" w:hAnsi="Calibri" w:cs="Calibri"/>
                 <w:sz w:val="16"/>
                 <w:szCs w:val="16"/>
-                <w:lang w:eastAsia="en-NL"/>
+                <w:lang/>
               </w:rPr>
               <w:t>[m]</w:t>
             </w:r>
@@ -575,7 +589,7 @@
                 <w:b w:val="0"/>
                 <w:sz w:val="16"/>
                 <w:szCs w:val="16"/>
-                <w:lang w:eastAsia="en-NL"/>
+                <w:lang/>
               </w:rPr>
             </w:pPr>
             <w:proofErr w:type="spellStart"/>
@@ -584,7 +598,7 @@
                 <w:rFonts w:ascii="Calibri" w:hAnsi="Calibri" w:cs="Calibri"/>
                 <w:sz w:val="16"/>
                 <w:szCs w:val="16"/>
-                <w:lang w:eastAsia="en-NL"/>
+                <w:lang/>
               </w:rPr>
               <w:t>Temp.Res</w:t>
             </w:r>
@@ -594,7 +608,7 @@
                 <w:rFonts w:ascii="Calibri" w:hAnsi="Calibri" w:cs="Calibri"/>
                 <w:sz w:val="16"/>
                 <w:szCs w:val="16"/>
-                <w:lang w:eastAsia="en-NL"/>
+                <w:lang/>
               </w:rPr>
               <w:t xml:space="preserve">. </w:t>
             </w:r>
@@ -606,7 +620,7 @@
                 <w:rFonts w:ascii="Calibri" w:hAnsi="Calibri" w:cs="Calibri"/>
                 <w:sz w:val="16"/>
                 <w:szCs w:val="16"/>
-                <w:lang w:eastAsia="en-NL"/>
+                <w:lang/>
               </w:rPr>
             </w:pPr>
             <w:r>
@@ -614,7 +628,7 @@
                 <w:rFonts w:ascii="Calibri" w:hAnsi="Calibri" w:cs="Calibri"/>
                 <w:sz w:val="16"/>
                 <w:szCs w:val="16"/>
-                <w:lang w:eastAsia="en-NL"/>
+                <w:lang/>
               </w:rPr>
               <w:t>[d]</w:t>
             </w:r>
@@ -633,7 +647,7 @@
                 <w:rFonts w:ascii="Calibri" w:hAnsi="Calibri" w:cs="Calibri"/>
                 <w:sz w:val="16"/>
                 <w:szCs w:val="16"/>
-                <w:lang w:eastAsia="en-NL"/>
+                <w:lang/>
               </w:rPr>
             </w:pPr>
             <w:r>
@@ -641,7 +655,7 @@
                 <w:rFonts w:ascii="Calibri" w:hAnsi="Calibri" w:cs="Calibri"/>
                 <w:sz w:val="16"/>
                 <w:szCs w:val="16"/>
-                <w:lang w:eastAsia="en-NL"/>
+                <w:lang/>
               </w:rPr>
               <w:t>From</w:t>
             </w:r>
@@ -660,7 +674,7 @@
                 <w:rFonts w:ascii="Calibri" w:hAnsi="Calibri" w:cs="Calibri"/>
                 <w:sz w:val="16"/>
                 <w:szCs w:val="16"/>
-                <w:lang w:eastAsia="en-NL"/>
+                <w:lang/>
               </w:rPr>
             </w:pPr>
             <w:r>
@@ -668,7 +682,7 @@
                 <w:rFonts w:ascii="Calibri" w:hAnsi="Calibri" w:cs="Calibri"/>
                 <w:sz w:val="16"/>
                 <w:szCs w:val="16"/>
-                <w:lang w:eastAsia="en-NL"/>
+                <w:lang/>
               </w:rPr>
               <w:t>To</w:t>
             </w:r>
@@ -685,7 +699,7 @@
                 <w:rFonts w:ascii="Calibri" w:hAnsi="Calibri" w:cs="Calibri"/>
                 <w:sz w:val="16"/>
                 <w:szCs w:val="16"/>
-                <w:lang w:eastAsia="en-NL"/>
+                <w:lang/>
               </w:rPr>
             </w:pPr>
             <w:r>
@@ -693,7 +707,7 @@
                 <w:rFonts w:ascii="Calibri" w:hAnsi="Calibri" w:cs="Calibri"/>
                 <w:sz w:val="16"/>
                 <w:szCs w:val="16"/>
-                <w:lang w:eastAsia="en-NL"/>
+                <w:lang/>
               </w:rPr>
               <w:t>Used for</w:t>
             </w:r>
@@ -717,7 +731,7 @@
                 <w:rFonts w:ascii="Calibri" w:hAnsi="Calibri" w:cs="Calibri"/>
                 <w:sz w:val="16"/>
                 <w:szCs w:val="16"/>
-                <w:lang w:eastAsia="en-NL"/>
+                <w:lang/>
               </w:rPr>
             </w:pPr>
             <w:r>
@@ -725,7 +739,7 @@
                 <w:rFonts w:ascii="Calibri" w:hAnsi="Calibri" w:cs="Calibri"/>
                 <w:sz w:val="16"/>
                 <w:szCs w:val="16"/>
-                <w:lang w:eastAsia="en-NL"/>
+                <w:lang/>
               </w:rPr>
               <w:t>Daily rainfall</w:t>
             </w:r>
@@ -744,7 +758,7 @@
                 <w:rFonts w:ascii="Calibri" w:hAnsi="Calibri" w:cs="Calibri"/>
                 <w:sz w:val="16"/>
                 <w:szCs w:val="16"/>
-                <w:lang w:eastAsia="en-NL"/>
+                <w:lang/>
               </w:rPr>
             </w:pPr>
             <w:r>
@@ -752,7 +766,7 @@
                 <w:rFonts w:ascii="Calibri" w:hAnsi="Calibri" w:cs="Calibri"/>
                 <w:sz w:val="16"/>
                 <w:szCs w:val="16"/>
-                <w:lang w:eastAsia="en-NL"/>
+                <w:lang/>
               </w:rPr>
               <w:t>CHRIPS</w:t>
             </w:r>
@@ -772,7 +786,7 @@
                 <w:sz w:val="16"/>
                 <w:szCs w:val="16"/>
                 <w:u w:val="single"/>
-                <w:lang w:eastAsia="en-NL"/>
+                <w:lang/>
               </w:rPr>
             </w:pPr>
             <w:hyperlink r:id="rId11" w:history="1">
@@ -782,7 +796,7 @@
                   <w:rFonts w:ascii="Calibri" w:hAnsi="Calibri" w:cs="Calibri"/>
                   <w:sz w:val="16"/>
                   <w:szCs w:val="16"/>
-                  <w:lang w:eastAsia="en-NL"/>
+                  <w:lang/>
                 </w:rPr>
                 <w:t>\\QNAP01</w:t>
               </w:r>
@@ -803,7 +817,7 @@
                 <w:rFonts w:ascii="Calibri" w:hAnsi="Calibri" w:cs="Calibri"/>
                 <w:sz w:val="16"/>
                 <w:szCs w:val="16"/>
-                <w:lang w:eastAsia="en-NL"/>
+                <w:lang/>
               </w:rPr>
             </w:pPr>
             <w:r>
@@ -811,7 +825,7 @@
                 <w:rFonts w:ascii="Calibri" w:hAnsi="Calibri" w:cs="Calibri"/>
                 <w:sz w:val="16"/>
                 <w:szCs w:val="16"/>
-                <w:lang w:eastAsia="en-NL"/>
+                <w:lang/>
               </w:rPr>
               <w:t>5000</w:t>
             </w:r>
@@ -831,7 +845,7 @@
                 <w:rFonts w:ascii="Calibri" w:hAnsi="Calibri" w:cs="Calibri"/>
                 <w:sz w:val="16"/>
                 <w:szCs w:val="16"/>
-                <w:lang w:eastAsia="en-NL"/>
+                <w:lang/>
               </w:rPr>
             </w:pPr>
             <w:r>
@@ -839,7 +853,7 @@
                 <w:rFonts w:ascii="Calibri" w:hAnsi="Calibri" w:cs="Calibri"/>
                 <w:sz w:val="16"/>
                 <w:szCs w:val="16"/>
-                <w:lang w:eastAsia="en-NL"/>
+                <w:lang/>
               </w:rPr>
               <w:t>1</w:t>
             </w:r>
@@ -859,7 +873,7 @@
                 <w:rFonts w:ascii="Calibri" w:hAnsi="Calibri" w:cs="Calibri"/>
                 <w:sz w:val="16"/>
                 <w:szCs w:val="16"/>
-                <w:lang w:eastAsia="en-NL"/>
+                <w:lang/>
               </w:rPr>
             </w:pPr>
             <w:r>
@@ -867,7 +881,7 @@
                 <w:rFonts w:ascii="Calibri" w:hAnsi="Calibri" w:cs="Calibri"/>
                 <w:sz w:val="16"/>
                 <w:szCs w:val="16"/>
-                <w:lang w:eastAsia="en-NL"/>
+                <w:lang/>
               </w:rPr>
               <w:t>1/1/1987</w:t>
             </w:r>
@@ -887,7 +901,7 @@
                 <w:rFonts w:ascii="Calibri" w:hAnsi="Calibri" w:cs="Calibri"/>
                 <w:sz w:val="16"/>
                 <w:szCs w:val="16"/>
-                <w:lang w:eastAsia="en-NL"/>
+                <w:lang/>
               </w:rPr>
             </w:pPr>
             <w:r>
@@ -895,7 +909,7 @@
                 <w:rFonts w:ascii="Calibri" w:hAnsi="Calibri" w:cs="Calibri"/>
                 <w:sz w:val="16"/>
                 <w:szCs w:val="16"/>
-                <w:lang w:eastAsia="en-NL"/>
+                <w:lang/>
               </w:rPr>
               <w:t>12/31/2017</w:t>
             </w:r>
@@ -912,7 +926,7 @@
                 <w:rFonts w:ascii="Calibri" w:hAnsi="Calibri" w:cs="Calibri"/>
                 <w:sz w:val="16"/>
                 <w:szCs w:val="16"/>
-                <w:lang w:eastAsia="en-NL"/>
+                <w:lang/>
               </w:rPr>
             </w:pPr>
             <w:r>
@@ -920,7 +934,7 @@
                 <w:rFonts w:ascii="Calibri" w:hAnsi="Calibri" w:cs="Calibri"/>
                 <w:sz w:val="16"/>
                 <w:szCs w:val="16"/>
-                <w:lang w:eastAsia="en-NL"/>
+                <w:lang/>
               </w:rPr>
               <w:t>LS</w:t>
             </w:r>
@@ -944,7 +958,7 @@
                 <w:rFonts w:ascii="Calibri" w:hAnsi="Calibri" w:cs="Calibri"/>
                 <w:sz w:val="16"/>
                 <w:szCs w:val="16"/>
-                <w:lang w:eastAsia="en-NL"/>
+                <w:lang/>
               </w:rPr>
             </w:pPr>
             <w:r>
@@ -952,7 +966,7 @@
                 <w:rFonts w:ascii="Calibri" w:hAnsi="Calibri" w:cs="Calibri"/>
                 <w:sz w:val="16"/>
                 <w:szCs w:val="16"/>
-                <w:lang w:eastAsia="en-NL"/>
+                <w:lang/>
               </w:rPr>
               <w:t>Elevation</w:t>
             </w:r>
@@ -971,7 +985,7 @@
                 <w:rFonts w:ascii="Calibri" w:hAnsi="Calibri" w:cs="Calibri"/>
                 <w:sz w:val="16"/>
                 <w:szCs w:val="16"/>
-                <w:lang w:eastAsia="en-NL"/>
+                <w:lang/>
               </w:rPr>
             </w:pPr>
             <w:r>
@@ -979,7 +993,7 @@
                 <w:rFonts w:ascii="Calibri" w:hAnsi="Calibri" w:cs="Calibri"/>
                 <w:sz w:val="16"/>
                 <w:szCs w:val="16"/>
-                <w:lang w:eastAsia="en-NL"/>
+                <w:lang/>
               </w:rPr>
               <w:t>SRTM</w:t>
             </w:r>
@@ -999,7 +1013,7 @@
                 <w:sz w:val="16"/>
                 <w:szCs w:val="16"/>
                 <w:u w:val="single"/>
-                <w:lang w:eastAsia="en-NL"/>
+                <w:lang/>
               </w:rPr>
             </w:pPr>
             <w:hyperlink r:id="rId12" w:history="1">
@@ -1009,7 +1023,7 @@
                   <w:rFonts w:ascii="Calibri" w:hAnsi="Calibri" w:cs="Calibri"/>
                   <w:sz w:val="16"/>
                   <w:szCs w:val="16"/>
-                  <w:lang w:eastAsia="en-NL"/>
+                  <w:lang/>
                 </w:rPr>
                 <w:t>https://dwtkns.com/srtm30m/</w:t>
               </w:r>
@@ -1030,7 +1044,7 @@
                 <w:rFonts w:ascii="Calibri" w:hAnsi="Calibri" w:cs="Calibri"/>
                 <w:sz w:val="16"/>
                 <w:szCs w:val="16"/>
-                <w:lang w:eastAsia="en-NL"/>
+                <w:lang/>
               </w:rPr>
             </w:pPr>
             <w:r>
@@ -1038,7 +1052,7 @@
                 <w:rFonts w:ascii="Calibri" w:hAnsi="Calibri" w:cs="Calibri"/>
                 <w:sz w:val="16"/>
                 <w:szCs w:val="16"/>
-                <w:lang w:eastAsia="en-NL"/>
+                <w:lang/>
               </w:rPr>
               <w:t>30</w:t>
             </w:r>
@@ -1057,7 +1071,7 @@
                 <w:rFonts w:ascii="Calibri" w:hAnsi="Calibri" w:cs="Calibri"/>
                 <w:sz w:val="16"/>
                 <w:szCs w:val="16"/>
-                <w:lang w:eastAsia="en-NL"/>
+                <w:lang/>
               </w:rPr>
             </w:pPr>
             <w:r>
@@ -1065,7 +1079,7 @@
                 <w:rFonts w:ascii="Calibri" w:hAnsi="Calibri" w:cs="Calibri"/>
                 <w:sz w:val="16"/>
                 <w:szCs w:val="16"/>
-                <w:lang w:eastAsia="en-NL"/>
+                <w:lang/>
               </w:rPr>
               <w:t>-</w:t>
             </w:r>
@@ -1083,7 +1097,7 @@
                 <w:rFonts w:ascii="Calibri" w:hAnsi="Calibri" w:cs="Calibri"/>
                 <w:sz w:val="16"/>
                 <w:szCs w:val="16"/>
-                <w:lang w:eastAsia="en-NL"/>
+                <w:lang/>
               </w:rPr>
             </w:pPr>
             <w:r>
@@ -1091,7 +1105,7 @@
                 <w:rFonts w:ascii="Calibri" w:hAnsi="Calibri" w:cs="Calibri"/>
                 <w:sz w:val="16"/>
                 <w:szCs w:val="16"/>
-                <w:lang w:eastAsia="en-NL"/>
+                <w:lang/>
               </w:rPr>
               <w:t>-</w:t>
             </w:r>
@@ -1109,7 +1123,7 @@
                 <w:rFonts w:ascii="Calibri" w:hAnsi="Calibri" w:cs="Calibri"/>
                 <w:sz w:val="16"/>
                 <w:szCs w:val="16"/>
-                <w:lang w:eastAsia="en-NL"/>
+                <w:lang/>
               </w:rPr>
             </w:pPr>
             <w:r>
@@ -1117,7 +1131,7 @@
                 <w:rFonts w:ascii="Calibri" w:hAnsi="Calibri" w:cs="Calibri"/>
                 <w:sz w:val="16"/>
                 <w:szCs w:val="16"/>
-                <w:lang w:eastAsia="en-NL"/>
+                <w:lang/>
               </w:rPr>
               <w:t>-</w:t>
             </w:r>
@@ -1134,7 +1148,7 @@
                 <w:rFonts w:ascii="Calibri" w:hAnsi="Calibri" w:cs="Calibri"/>
                 <w:sz w:val="16"/>
                 <w:szCs w:val="16"/>
-                <w:lang w:eastAsia="en-NL"/>
+                <w:lang/>
               </w:rPr>
             </w:pPr>
             <w:r>
@@ -1142,7 +1156,7 @@
                 <w:rFonts w:ascii="Calibri" w:hAnsi="Calibri" w:cs="Calibri"/>
                 <w:sz w:val="16"/>
                 <w:szCs w:val="16"/>
-                <w:lang w:eastAsia="en-NL"/>
+                <w:lang/>
               </w:rPr>
               <w:t>LS</w:t>
             </w:r>
@@ -1166,7 +1180,7 @@
                 <w:rFonts w:ascii="Calibri" w:hAnsi="Calibri" w:cs="Calibri"/>
                 <w:sz w:val="16"/>
                 <w:szCs w:val="16"/>
-                <w:lang w:eastAsia="en-NL"/>
+                <w:lang/>
               </w:rPr>
             </w:pPr>
             <w:r>
@@ -1174,7 +1188,7 @@
                 <w:rFonts w:ascii="Calibri" w:hAnsi="Calibri" w:cs="Calibri"/>
                 <w:sz w:val="16"/>
                 <w:szCs w:val="16"/>
-                <w:lang w:eastAsia="en-NL"/>
+                <w:lang/>
               </w:rPr>
               <w:t>NDVI</w:t>
             </w:r>
@@ -1193,7 +1207,7 @@
                 <w:rFonts w:ascii="Calibri" w:hAnsi="Calibri" w:cs="Calibri"/>
                 <w:sz w:val="16"/>
                 <w:szCs w:val="16"/>
-                <w:lang w:eastAsia="en-NL"/>
+                <w:lang/>
               </w:rPr>
             </w:pPr>
             <w:r>
@@ -1201,7 +1215,7 @@
                 <w:rFonts w:ascii="Calibri" w:hAnsi="Calibri" w:cs="Calibri"/>
                 <w:sz w:val="16"/>
                 <w:szCs w:val="16"/>
-                <w:lang w:eastAsia="en-NL"/>
+                <w:lang/>
               </w:rPr>
               <w:t>MODIS</w:t>
             </w:r>
@@ -1221,7 +1235,7 @@
                 <w:sz w:val="16"/>
                 <w:szCs w:val="16"/>
                 <w:u w:val="single"/>
-                <w:lang w:eastAsia="en-NL"/>
+                <w:lang/>
               </w:rPr>
             </w:pPr>
             <w:hyperlink r:id="rId13" w:history="1">
@@ -1231,7 +1245,7 @@
                   <w:rFonts w:ascii="Calibri" w:hAnsi="Calibri" w:cs="Calibri"/>
                   <w:sz w:val="16"/>
                   <w:szCs w:val="16"/>
-                  <w:lang w:eastAsia="en-NL"/>
+                  <w:lang/>
                 </w:rPr>
                 <w:t>https://lpdaacsvc.cr.usgs.gov/appeears/task/area</w:t>
               </w:r>
@@ -1252,7 +1266,7 @@
                 <w:rFonts w:ascii="Calibri" w:hAnsi="Calibri" w:cs="Calibri"/>
                 <w:sz w:val="16"/>
                 <w:szCs w:val="16"/>
-                <w:lang w:eastAsia="en-NL"/>
+                <w:lang/>
               </w:rPr>
             </w:pPr>
             <w:r>
@@ -1260,7 +1274,7 @@
                 <w:rFonts w:ascii="Calibri" w:hAnsi="Calibri" w:cs="Calibri"/>
                 <w:sz w:val="16"/>
                 <w:szCs w:val="16"/>
-                <w:lang w:eastAsia="en-NL"/>
+                <w:lang/>
               </w:rPr>
               <w:t>250</w:t>
             </w:r>
@@ -1280,7 +1294,7 @@
                 <w:rFonts w:ascii="Calibri" w:hAnsi="Calibri" w:cs="Calibri"/>
                 <w:sz w:val="16"/>
                 <w:szCs w:val="16"/>
-                <w:lang w:eastAsia="en-NL"/>
+                <w:lang/>
               </w:rPr>
             </w:pPr>
             <w:r>
@@ -1288,7 +1302,7 @@
                 <w:rFonts w:ascii="Calibri" w:hAnsi="Calibri" w:cs="Calibri"/>
                 <w:sz w:val="16"/>
                 <w:szCs w:val="16"/>
-                <w:lang w:eastAsia="en-NL"/>
+                <w:lang/>
               </w:rPr>
               <w:t>16</w:t>
             </w:r>
@@ -1308,7 +1322,7 @@
                 <w:rFonts w:ascii="Calibri" w:hAnsi="Calibri" w:cs="Calibri"/>
                 <w:sz w:val="16"/>
                 <w:szCs w:val="16"/>
-                <w:lang w:eastAsia="en-NL"/>
+                <w:lang/>
               </w:rPr>
             </w:pPr>
             <w:r>
@@ -1316,7 +1330,7 @@
                 <w:rFonts w:ascii="Calibri" w:hAnsi="Calibri" w:cs="Calibri"/>
                 <w:sz w:val="16"/>
                 <w:szCs w:val="16"/>
-                <w:lang w:eastAsia="en-NL"/>
+                <w:lang/>
               </w:rPr>
               <w:t>2/18/2002</w:t>
             </w:r>
@@ -1336,7 +1350,7 @@
                 <w:rFonts w:ascii="Calibri" w:hAnsi="Calibri" w:cs="Calibri"/>
                 <w:sz w:val="16"/>
                 <w:szCs w:val="16"/>
-                <w:lang w:eastAsia="en-NL"/>
+                <w:lang/>
               </w:rPr>
             </w:pPr>
             <w:r>
@@ -1344,7 +1358,7 @@
                 <w:rFonts w:ascii="Calibri" w:hAnsi="Calibri" w:cs="Calibri"/>
                 <w:sz w:val="16"/>
                 <w:szCs w:val="16"/>
-                <w:lang w:eastAsia="en-NL"/>
+                <w:lang/>
               </w:rPr>
               <w:t>1/1/2018</w:t>
             </w:r>
@@ -1361,7 +1375,7 @@
                 <w:rFonts w:ascii="Calibri" w:hAnsi="Calibri" w:cs="Calibri"/>
                 <w:sz w:val="16"/>
                 <w:szCs w:val="16"/>
-                <w:lang w:eastAsia="en-NL"/>
+                <w:lang/>
               </w:rPr>
             </w:pPr>
             <w:r>
@@ -1369,7 +1383,7 @@
                 <w:rFonts w:ascii="Calibri" w:hAnsi="Calibri" w:cs="Calibri"/>
                 <w:sz w:val="16"/>
                 <w:szCs w:val="16"/>
-                <w:lang w:eastAsia="en-NL"/>
+                <w:lang/>
               </w:rPr>
               <w:t>LS</w:t>
             </w:r>
@@ -1393,7 +1407,7 @@
                 <w:rFonts w:ascii="Calibri" w:hAnsi="Calibri" w:cs="Calibri"/>
                 <w:sz w:val="16"/>
                 <w:szCs w:val="16"/>
-                <w:lang w:eastAsia="en-NL"/>
+                <w:lang/>
               </w:rPr>
             </w:pPr>
             <w:proofErr w:type="spellStart"/>
@@ -1402,7 +1416,7 @@
                 <w:rFonts w:ascii="Calibri" w:hAnsi="Calibri" w:cs="Calibri"/>
                 <w:sz w:val="16"/>
                 <w:szCs w:val="16"/>
-                <w:lang w:eastAsia="en-NL"/>
+                <w:lang/>
               </w:rPr>
               <w:t>ETRef</w:t>
             </w:r>
@@ -1422,7 +1436,7 @@
                 <w:rFonts w:ascii="Calibri" w:hAnsi="Calibri" w:cs="Calibri"/>
                 <w:sz w:val="16"/>
                 <w:szCs w:val="16"/>
-                <w:lang w:eastAsia="en-NL"/>
+                <w:lang/>
               </w:rPr>
             </w:pPr>
             <w:r>
@@ -1430,7 +1444,7 @@
                 <w:rFonts w:ascii="Calibri" w:hAnsi="Calibri" w:cs="Calibri"/>
                 <w:sz w:val="16"/>
                 <w:szCs w:val="16"/>
-                <w:lang w:eastAsia="en-NL"/>
+                <w:lang/>
               </w:rPr>
               <w:t>Earth2Observe</w:t>
             </w:r>
@@ -1450,7 +1464,7 @@
                 <w:sz w:val="16"/>
                 <w:szCs w:val="16"/>
                 <w:u w:val="single"/>
-                <w:lang w:eastAsia="en-NL"/>
+                <w:lang/>
               </w:rPr>
             </w:pPr>
             <w:hyperlink r:id="rId14" w:history="1">
@@ -1460,7 +1474,7 @@
                   <w:rFonts w:ascii="Calibri" w:hAnsi="Calibri" w:cs="Calibri"/>
                   <w:sz w:val="16"/>
                   <w:szCs w:val="16"/>
-                  <w:lang w:eastAsia="en-NL"/>
+                  <w:lang/>
                 </w:rPr>
                 <w:t>http://www.earth2observe.eu</w:t>
               </w:r>
@@ -1481,7 +1495,7 @@
                 <w:rFonts w:ascii="Calibri" w:hAnsi="Calibri" w:cs="Calibri"/>
                 <w:sz w:val="16"/>
                 <w:szCs w:val="16"/>
-                <w:lang w:eastAsia="en-NL"/>
+                <w:lang/>
               </w:rPr>
             </w:pPr>
             <w:r>
@@ -1489,7 +1503,7 @@
                 <w:rFonts w:ascii="Calibri" w:hAnsi="Calibri" w:cs="Calibri"/>
                 <w:sz w:val="16"/>
                 <w:szCs w:val="16"/>
-                <w:lang w:eastAsia="en-NL"/>
+                <w:lang/>
               </w:rPr>
               <w:t>10000</w:t>
             </w:r>
@@ -1509,7 +1523,7 @@
                 <w:rFonts w:ascii="Calibri" w:hAnsi="Calibri" w:cs="Calibri"/>
                 <w:sz w:val="16"/>
                 <w:szCs w:val="16"/>
-                <w:lang w:eastAsia="en-NL"/>
+                <w:lang/>
               </w:rPr>
             </w:pPr>
             <w:r>
@@ -1517,7 +1531,7 @@
                 <w:rFonts w:ascii="Calibri" w:hAnsi="Calibri" w:cs="Calibri"/>
                 <w:sz w:val="16"/>
                 <w:szCs w:val="16"/>
-                <w:lang w:eastAsia="en-NL"/>
+                <w:lang/>
               </w:rPr>
               <w:t>1</w:t>
             </w:r>
@@ -1537,7 +1551,7 @@
                 <w:rFonts w:ascii="Calibri" w:hAnsi="Calibri" w:cs="Calibri"/>
                 <w:sz w:val="16"/>
                 <w:szCs w:val="16"/>
-                <w:lang w:eastAsia="en-NL"/>
+                <w:lang/>
               </w:rPr>
             </w:pPr>
             <w:r>
@@ -1545,7 +1559,7 @@
                 <w:rFonts w:ascii="Calibri" w:hAnsi="Calibri" w:cs="Calibri"/>
                 <w:sz w:val="16"/>
                 <w:szCs w:val="16"/>
-                <w:lang w:eastAsia="en-NL"/>
+                <w:lang/>
               </w:rPr>
               <w:t>1/1/1998</w:t>
             </w:r>
@@ -1565,7 +1579,7 @@
                 <w:rFonts w:ascii="Calibri" w:hAnsi="Calibri" w:cs="Calibri"/>
                 <w:sz w:val="16"/>
                 <w:szCs w:val="16"/>
-                <w:lang w:eastAsia="en-NL"/>
+                <w:lang/>
               </w:rPr>
             </w:pPr>
             <w:r>
@@ -1573,7 +1587,7 @@
                 <w:rFonts w:ascii="Calibri" w:hAnsi="Calibri" w:cs="Calibri"/>
                 <w:sz w:val="16"/>
                 <w:szCs w:val="16"/>
-                <w:lang w:eastAsia="en-NL"/>
+                <w:lang/>
               </w:rPr>
               <w:t>12/31/2012</w:t>
             </w:r>
@@ -1590,7 +1604,7 @@
                 <w:rFonts w:ascii="Calibri" w:hAnsi="Calibri" w:cs="Calibri"/>
                 <w:sz w:val="16"/>
                 <w:szCs w:val="16"/>
-                <w:lang w:eastAsia="en-NL"/>
+                <w:lang/>
               </w:rPr>
             </w:pPr>
             <w:r>
@@ -1598,7 +1612,7 @@
                 <w:rFonts w:ascii="Calibri" w:hAnsi="Calibri" w:cs="Calibri"/>
                 <w:sz w:val="16"/>
                 <w:szCs w:val="16"/>
-                <w:lang w:eastAsia="en-NL"/>
+                <w:lang/>
               </w:rPr>
               <w:t>LS</w:t>
             </w:r>
@@ -1622,7 +1636,7 @@
                 <w:rFonts w:ascii="Calibri" w:hAnsi="Calibri" w:cs="Calibri"/>
                 <w:sz w:val="16"/>
                 <w:szCs w:val="16"/>
-                <w:lang w:eastAsia="en-NL"/>
+                <w:lang w:val="fr-FR"/>
               </w:rPr>
             </w:pPr>
             <w:r>
@@ -1630,9 +1644,29 @@
                 <w:rFonts w:ascii="Calibri" w:hAnsi="Calibri" w:cs="Calibri"/>
                 <w:sz w:val="16"/>
                 <w:szCs w:val="16"/>
-                <w:lang w:eastAsia="en-NL"/>
-              </w:rPr>
-              <w:t>Soi Nutrient Content (P, K)</w:t>
+                <w:lang w:val="fr-FR"/>
+              </w:rPr>
+              <w:t xml:space="preserve">Soi </w:t>
+            </w:r>
+            <w:proofErr w:type="spellStart"/>
+            <w:r>
+              <w:rPr>
+                <w:rFonts w:ascii="Calibri" w:hAnsi="Calibri" w:cs="Calibri"/>
+                <w:sz w:val="16"/>
+                <w:szCs w:val="16"/>
+                <w:lang w:val="fr-FR"/>
+              </w:rPr>
+              <w:t>Nutrient</w:t>
+            </w:r>
+            <w:proofErr w:type="spellEnd"/>
+            <w:r>
+              <w:rPr>
+                <w:rFonts w:ascii="Calibri" w:hAnsi="Calibri" w:cs="Calibri"/>
+                <w:sz w:val="16"/>
+                <w:szCs w:val="16"/>
+                <w:lang w:val="fr-FR"/>
+              </w:rPr>
+              <w:t xml:space="preserve"> Content (P, K)</w:t>
             </w:r>
           </w:p>
         </w:tc>
@@ -1649,7 +1683,7 @@
                 <w:rFonts w:ascii="Calibri" w:hAnsi="Calibri" w:cs="Calibri"/>
                 <w:sz w:val="16"/>
                 <w:szCs w:val="16"/>
-                <w:lang w:eastAsia="en-NL"/>
+                <w:lang/>
               </w:rPr>
             </w:pPr>
             <w:proofErr w:type="spellStart"/>
@@ -1658,7 +1692,7 @@
                 <w:rFonts w:ascii="Calibri" w:hAnsi="Calibri" w:cs="Calibri"/>
                 <w:sz w:val="16"/>
                 <w:szCs w:val="16"/>
-                <w:lang w:eastAsia="en-NL"/>
+                <w:lang/>
               </w:rPr>
               <w:t>SoilGrids</w:t>
             </w:r>
@@ -1668,7 +1702,7 @@
                 <w:rFonts w:ascii="Calibri" w:hAnsi="Calibri" w:cs="Calibri"/>
                 <w:sz w:val="16"/>
                 <w:szCs w:val="16"/>
-                <w:lang w:eastAsia="en-NL"/>
+                <w:lang/>
               </w:rPr>
               <w:t xml:space="preserve"> </w:t>
             </w:r>
@@ -1687,7 +1721,7 @@
                 <w:rFonts w:ascii="Calibri" w:hAnsi="Calibri" w:cs="Calibri"/>
                 <w:sz w:val="16"/>
                 <w:szCs w:val="16"/>
-                <w:lang w:eastAsia="en-NL"/>
+                <w:lang/>
               </w:rPr>
             </w:pPr>
             <w:r>
@@ -1695,7 +1729,7 @@
                 <w:rFonts w:ascii="Calibri" w:hAnsi="Calibri" w:cs="Calibri"/>
                 <w:sz w:val="16"/>
                 <w:szCs w:val="16"/>
-                <w:lang w:eastAsia="en-NL"/>
+                <w:lang/>
               </w:rPr>
               <w:t>https://www.isric.org/explore/isric-soil-data-hub</w:t>
             </w:r>
@@ -1715,7 +1749,7 @@
                 <w:rFonts w:ascii="Calibri" w:hAnsi="Calibri" w:cs="Calibri"/>
                 <w:sz w:val="16"/>
                 <w:szCs w:val="16"/>
-                <w:lang w:eastAsia="en-NL"/>
+                <w:lang/>
               </w:rPr>
             </w:pPr>
             <w:r>
@@ -1723,7 +1757,7 @@
                 <w:rFonts w:ascii="Calibri" w:hAnsi="Calibri" w:cs="Calibri"/>
                 <w:sz w:val="16"/>
                 <w:szCs w:val="16"/>
-                <w:lang w:eastAsia="en-NL"/>
+                <w:lang/>
               </w:rPr>
               <w:t>250</w:t>
             </w:r>
@@ -1742,7 +1776,7 @@
                 <w:rFonts w:ascii="Calibri" w:hAnsi="Calibri" w:cs="Calibri"/>
                 <w:sz w:val="16"/>
                 <w:szCs w:val="16"/>
-                <w:lang w:eastAsia="en-NL"/>
+                <w:lang/>
               </w:rPr>
             </w:pPr>
             <w:r>
@@ -1750,7 +1784,7 @@
                 <w:rFonts w:ascii="Calibri" w:hAnsi="Calibri" w:cs="Calibri"/>
                 <w:sz w:val="16"/>
                 <w:szCs w:val="16"/>
-                <w:lang w:eastAsia="en-NL"/>
+                <w:lang/>
               </w:rPr>
               <w:t>-</w:t>
             </w:r>
@@ -1768,7 +1802,7 @@
                 <w:rFonts w:ascii="Calibri" w:hAnsi="Calibri" w:cs="Calibri"/>
                 <w:sz w:val="16"/>
                 <w:szCs w:val="16"/>
-                <w:lang w:eastAsia="en-NL"/>
+                <w:lang/>
               </w:rPr>
             </w:pPr>
             <w:r>
@@ -1776,7 +1810,7 @@
                 <w:rFonts w:ascii="Calibri" w:hAnsi="Calibri" w:cs="Calibri"/>
                 <w:sz w:val="16"/>
                 <w:szCs w:val="16"/>
-                <w:lang w:eastAsia="en-NL"/>
+                <w:lang/>
               </w:rPr>
               <w:t>-</w:t>
             </w:r>
@@ -1794,7 +1828,7 @@
                 <w:rFonts w:ascii="Calibri" w:hAnsi="Calibri" w:cs="Calibri"/>
                 <w:sz w:val="16"/>
                 <w:szCs w:val="16"/>
-                <w:lang w:eastAsia="en-NL"/>
+                <w:lang/>
               </w:rPr>
             </w:pPr>
             <w:r>
@@ -1802,7 +1836,7 @@
                 <w:rFonts w:ascii="Calibri" w:hAnsi="Calibri" w:cs="Calibri"/>
                 <w:sz w:val="16"/>
                 <w:szCs w:val="16"/>
-                <w:lang w:eastAsia="en-NL"/>
+                <w:lang/>
               </w:rPr>
               <w:t>-</w:t>
             </w:r>
@@ -1819,7 +1853,7 @@
                 <w:rFonts w:ascii="Calibri" w:hAnsi="Calibri" w:cs="Calibri"/>
                 <w:sz w:val="16"/>
                 <w:szCs w:val="16"/>
-                <w:lang w:eastAsia="en-NL"/>
+                <w:lang/>
               </w:rPr>
             </w:pPr>
             <w:r>
@@ -1827,7 +1861,7 @@
                 <w:rFonts w:ascii="Calibri" w:hAnsi="Calibri" w:cs="Calibri"/>
                 <w:sz w:val="16"/>
                 <w:szCs w:val="16"/>
-                <w:lang w:eastAsia="en-NL"/>
+                <w:lang/>
               </w:rPr>
               <w:t>LS</w:t>
             </w:r>
@@ -1851,7 +1885,7 @@
                 <w:rFonts w:ascii="Calibri" w:hAnsi="Calibri" w:cs="Calibri"/>
                 <w:sz w:val="16"/>
                 <w:szCs w:val="16"/>
-                <w:lang w:eastAsia="en-NL"/>
+                <w:lang/>
               </w:rPr>
             </w:pPr>
             <w:r>
@@ -1859,7 +1893,7 @@
                 <w:rFonts w:ascii="Calibri" w:hAnsi="Calibri" w:cs="Calibri"/>
                 <w:sz w:val="16"/>
                 <w:szCs w:val="16"/>
-                <w:lang w:eastAsia="en-NL"/>
+                <w:lang/>
               </w:rPr>
               <w:t>Soil Hydraulic Properties (</w:t>
             </w:r>
@@ -1869,7 +1903,7 @@
                 <w:rFonts w:ascii="Calibri" w:hAnsi="Calibri" w:cs="Calibri"/>
                 <w:sz w:val="16"/>
                 <w:szCs w:val="16"/>
-                <w:lang w:eastAsia="en-NL"/>
+                <w:lang/>
               </w:rPr>
               <w:t>Ksat</w:t>
             </w:r>
@@ -1879,7 +1913,7 @@
                 <w:rFonts w:ascii="Calibri" w:hAnsi="Calibri" w:cs="Calibri"/>
                 <w:sz w:val="16"/>
                 <w:szCs w:val="16"/>
-                <w:lang w:eastAsia="en-NL"/>
+                <w:lang/>
               </w:rPr>
               <w:t xml:space="preserve">, </w:t>
             </w:r>
@@ -1889,7 +1923,7 @@
                 <w:rFonts w:ascii="Calibri" w:hAnsi="Calibri" w:cs="Calibri"/>
                 <w:sz w:val="16"/>
                 <w:szCs w:val="16"/>
-                <w:lang w:eastAsia="en-NL"/>
+                <w:lang/>
               </w:rPr>
               <w:t>WCavaiL</w:t>
             </w:r>
@@ -1899,7 +1933,7 @@
                 <w:rFonts w:ascii="Calibri" w:hAnsi="Calibri" w:cs="Calibri"/>
                 <w:sz w:val="16"/>
                 <w:szCs w:val="16"/>
-                <w:lang w:eastAsia="en-NL"/>
+                <w:lang/>
               </w:rPr>
               <w:t>)</w:t>
             </w:r>
@@ -1918,7 +1952,7 @@
                 <w:rFonts w:ascii="Calibri" w:hAnsi="Calibri" w:cs="Calibri"/>
                 <w:sz w:val="16"/>
                 <w:szCs w:val="16"/>
-                <w:lang w:eastAsia="en-NL"/>
+                <w:lang/>
               </w:rPr>
             </w:pPr>
             <w:proofErr w:type="spellStart"/>
@@ -1927,7 +1961,7 @@
                 <w:rFonts w:ascii="Calibri" w:hAnsi="Calibri" w:cs="Calibri"/>
                 <w:sz w:val="16"/>
                 <w:szCs w:val="16"/>
-                <w:lang w:eastAsia="en-NL"/>
+                <w:lang/>
               </w:rPr>
               <w:t>HiHydroSoil</w:t>
             </w:r>
@@ -1947,7 +1981,7 @@
                 <w:rFonts w:ascii="Calibri" w:hAnsi="Calibri" w:cs="Calibri"/>
                 <w:sz w:val="16"/>
                 <w:szCs w:val="16"/>
-                <w:lang w:eastAsia="en-NL"/>
+                <w:lang/>
               </w:rPr>
             </w:pPr>
             <w:r>
@@ -1955,7 +1989,7 @@
                 <w:rFonts w:ascii="Calibri" w:hAnsi="Calibri" w:cs="Calibri"/>
                 <w:sz w:val="16"/>
                 <w:szCs w:val="16"/>
-                <w:lang w:eastAsia="en-NL"/>
+                <w:lang/>
               </w:rPr>
               <w:t xml:space="preserve">HHS v2.0 data was used which can be downloaded from the website. </w:t>
             </w:r>
@@ -1975,7 +2009,7 @@
                 <w:rFonts w:ascii="Calibri" w:hAnsi="Calibri" w:cs="Calibri"/>
                 <w:sz w:val="16"/>
                 <w:szCs w:val="16"/>
-                <w:lang w:eastAsia="en-NL"/>
+                <w:lang/>
               </w:rPr>
             </w:pPr>
             <w:r>
@@ -1983,7 +2017,7 @@
                 <w:rFonts w:ascii="Calibri" w:hAnsi="Calibri" w:cs="Calibri"/>
                 <w:sz w:val="16"/>
                 <w:szCs w:val="16"/>
-                <w:lang w:eastAsia="en-NL"/>
+                <w:lang/>
               </w:rPr>
               <w:t>250</w:t>
             </w:r>
@@ -2002,7 +2036,7 @@
                 <w:rFonts w:ascii="Calibri" w:hAnsi="Calibri" w:cs="Calibri"/>
                 <w:sz w:val="16"/>
                 <w:szCs w:val="16"/>
-                <w:lang w:eastAsia="en-NL"/>
+                <w:lang/>
               </w:rPr>
             </w:pPr>
             <w:r>
@@ -2010,7 +2044,7 @@
                 <w:rFonts w:ascii="Calibri" w:hAnsi="Calibri" w:cs="Calibri"/>
                 <w:sz w:val="16"/>
                 <w:szCs w:val="16"/>
-                <w:lang w:eastAsia="en-NL"/>
+                <w:lang/>
               </w:rPr>
               <w:t>-</w:t>
             </w:r>
@@ -2028,7 +2062,7 @@
                 <w:rFonts w:ascii="Calibri" w:hAnsi="Calibri" w:cs="Calibri"/>
                 <w:sz w:val="16"/>
                 <w:szCs w:val="16"/>
-                <w:lang w:eastAsia="en-NL"/>
+                <w:lang/>
               </w:rPr>
             </w:pPr>
             <w:r>
@@ -2036,7 +2070,7 @@
                 <w:rFonts w:ascii="Calibri" w:hAnsi="Calibri" w:cs="Calibri"/>
                 <w:sz w:val="16"/>
                 <w:szCs w:val="16"/>
-                <w:lang w:eastAsia="en-NL"/>
+                <w:lang/>
               </w:rPr>
               <w:t>-</w:t>
             </w:r>
@@ -2054,7 +2088,7 @@
                 <w:rFonts w:ascii="Calibri" w:hAnsi="Calibri" w:cs="Calibri"/>
                 <w:sz w:val="16"/>
                 <w:szCs w:val="16"/>
-                <w:lang w:eastAsia="en-NL"/>
+                <w:lang/>
               </w:rPr>
             </w:pPr>
             <w:r>
@@ -2062,7 +2096,7 @@
                 <w:rFonts w:ascii="Calibri" w:hAnsi="Calibri" w:cs="Calibri"/>
                 <w:sz w:val="16"/>
                 <w:szCs w:val="16"/>
-                <w:lang w:eastAsia="en-NL"/>
+                <w:lang/>
               </w:rPr>
               <w:t>-</w:t>
             </w:r>
@@ -2079,7 +2113,7 @@
                 <w:rFonts w:ascii="Calibri" w:hAnsi="Calibri" w:cs="Calibri"/>
                 <w:sz w:val="16"/>
                 <w:szCs w:val="16"/>
-                <w:lang w:eastAsia="en-NL"/>
+                <w:lang/>
               </w:rPr>
             </w:pPr>
             <w:r>
@@ -2087,7 +2121,7 @@
                 <w:rFonts w:ascii="Calibri" w:hAnsi="Calibri" w:cs="Calibri"/>
                 <w:sz w:val="16"/>
                 <w:szCs w:val="16"/>
-                <w:lang w:eastAsia="en-NL"/>
+                <w:lang/>
               </w:rPr>
               <w:t>LS</w:t>
             </w:r>
@@ -2111,7 +2145,7 @@
                 <w:rFonts w:ascii="Calibri" w:hAnsi="Calibri" w:cs="Calibri"/>
                 <w:sz w:val="16"/>
                 <w:szCs w:val="16"/>
-                <w:lang w:eastAsia="en-NL"/>
+                <w:lang/>
               </w:rPr>
             </w:pPr>
             <w:r>
@@ -2119,7 +2153,7 @@
                 <w:rFonts w:ascii="Calibri" w:hAnsi="Calibri" w:cs="Calibri"/>
                 <w:sz w:val="16"/>
                 <w:szCs w:val="16"/>
-                <w:lang w:eastAsia="en-NL"/>
+                <w:lang/>
               </w:rPr>
               <w:t>Temperature</w:t>
             </w:r>
@@ -2131,7 +2165,7 @@
                 <w:rFonts w:ascii="Calibri" w:hAnsi="Calibri" w:cs="Calibri"/>
                 <w:sz w:val="16"/>
                 <w:szCs w:val="16"/>
-                <w:lang w:eastAsia="en-NL"/>
+                <w:lang/>
               </w:rPr>
             </w:pPr>
             <w:r>
@@ -2139,29 +2173,27 @@
                 <w:rFonts w:ascii="Calibri" w:hAnsi="Calibri" w:cs="Calibri"/>
                 <w:sz w:val="16"/>
                 <w:szCs w:val="16"/>
-                <w:lang w:eastAsia="en-NL"/>
+                <w:lang/>
               </w:rPr>
               <w:t>(</w:t>
             </w:r>
             <w:proofErr w:type="spellStart"/>
-            <w:proofErr w:type="gramStart"/>
             <w:r>
               <w:rPr>
                 <w:rFonts w:ascii="Calibri" w:hAnsi="Calibri" w:cs="Calibri"/>
                 <w:sz w:val="16"/>
                 <w:szCs w:val="16"/>
-                <w:lang w:eastAsia="en-NL"/>
+                <w:lang/>
               </w:rPr>
               <w:t>tavg</w:t>
             </w:r>
             <w:proofErr w:type="spellEnd"/>
-            <w:proofErr w:type="gramEnd"/>
             <w:r>
               <w:rPr>
                 <w:rFonts w:ascii="Calibri" w:hAnsi="Calibri" w:cs="Calibri"/>
                 <w:sz w:val="16"/>
                 <w:szCs w:val="16"/>
-                <w:lang w:eastAsia="en-NL"/>
+                <w:lang/>
               </w:rPr>
               <w:t xml:space="preserve">, </w:t>
             </w:r>
@@ -2171,7 +2203,7 @@
                 <w:rFonts w:ascii="Calibri" w:hAnsi="Calibri" w:cs="Calibri"/>
                 <w:sz w:val="16"/>
                 <w:szCs w:val="16"/>
-                <w:lang w:eastAsia="en-NL"/>
+                <w:lang/>
               </w:rPr>
               <w:t>tmin</w:t>
             </w:r>
@@ -2181,7 +2213,7 @@
                 <w:rFonts w:ascii="Calibri" w:hAnsi="Calibri" w:cs="Calibri"/>
                 <w:sz w:val="16"/>
                 <w:szCs w:val="16"/>
-                <w:lang w:eastAsia="en-NL"/>
+                <w:lang/>
               </w:rPr>
               <w:t xml:space="preserve">, </w:t>
             </w:r>
@@ -2191,7 +2223,7 @@
                 <w:rFonts w:ascii="Calibri" w:hAnsi="Calibri" w:cs="Calibri"/>
                 <w:sz w:val="16"/>
                 <w:szCs w:val="16"/>
-                <w:lang w:eastAsia="en-NL"/>
+                <w:lang/>
               </w:rPr>
               <w:t>tmax</w:t>
             </w:r>
@@ -2201,7 +2233,7 @@
                 <w:rFonts w:ascii="Calibri" w:hAnsi="Calibri" w:cs="Calibri"/>
                 <w:sz w:val="16"/>
                 <w:szCs w:val="16"/>
-                <w:lang w:eastAsia="en-NL"/>
+                <w:lang/>
               </w:rPr>
               <w:t>)</w:t>
             </w:r>
@@ -2220,7 +2252,7 @@
                 <w:rFonts w:ascii="Calibri" w:hAnsi="Calibri" w:cs="Calibri"/>
                 <w:sz w:val="16"/>
                 <w:szCs w:val="16"/>
-                <w:lang w:eastAsia="en-NL"/>
+                <w:lang/>
               </w:rPr>
             </w:pPr>
             <w:r>
@@ -2228,7 +2260,7 @@
                 <w:rFonts w:ascii="Calibri" w:hAnsi="Calibri" w:cs="Calibri"/>
                 <w:sz w:val="16"/>
                 <w:szCs w:val="16"/>
-                <w:lang w:eastAsia="en-NL"/>
+                <w:lang/>
               </w:rPr>
               <w:t>ERA5</w:t>
             </w:r>
@@ -2247,7 +2279,7 @@
                 <w:rFonts w:ascii="Calibri" w:hAnsi="Calibri" w:cs="Calibri"/>
                 <w:sz w:val="16"/>
                 <w:szCs w:val="16"/>
-                <w:lang w:eastAsia="en-NL"/>
+                <w:lang/>
               </w:rPr>
             </w:pPr>
             <w:r>
@@ -2255,7 +2287,7 @@
                 <w:rFonts w:ascii="Calibri" w:hAnsi="Calibri" w:cs="Calibri"/>
                 <w:sz w:val="16"/>
                 <w:szCs w:val="16"/>
-                <w:lang w:eastAsia="en-NL"/>
+                <w:lang/>
               </w:rPr>
               <w:t xml:space="preserve">Data available on </w:t>
             </w:r>
@@ -2265,7 +2297,7 @@
                 <w:rFonts w:ascii="Calibri" w:hAnsi="Calibri" w:cs="Calibri"/>
                 <w:sz w:val="16"/>
                 <w:szCs w:val="16"/>
-                <w:lang w:eastAsia="en-NL"/>
+                <w:lang/>
               </w:rPr>
               <w:t>WonderWoman</w:t>
             </w:r>
@@ -2275,7 +2307,7 @@
                 <w:rFonts w:ascii="Calibri" w:hAnsi="Calibri" w:cs="Calibri"/>
                 <w:sz w:val="16"/>
                 <w:szCs w:val="16"/>
-                <w:lang w:eastAsia="en-NL"/>
+                <w:lang/>
               </w:rPr>
               <w:t xml:space="preserve"> (ask Sonu or Jack)</w:t>
             </w:r>
@@ -2295,7 +2327,7 @@
                 <w:rFonts w:ascii="Calibri" w:hAnsi="Calibri" w:cs="Calibri"/>
                 <w:sz w:val="16"/>
                 <w:szCs w:val="16"/>
-                <w:lang w:eastAsia="en-NL"/>
+                <w:lang/>
               </w:rPr>
             </w:pPr>
             <w:r>
@@ -2303,7 +2335,7 @@
                 <w:rFonts w:ascii="Calibri" w:hAnsi="Calibri" w:cs="Calibri"/>
                 <w:sz w:val="16"/>
                 <w:szCs w:val="16"/>
-                <w:lang w:eastAsia="en-NL"/>
+                <w:lang/>
               </w:rPr>
               <w:t>30000</w:t>
             </w:r>
@@ -2323,7 +2355,7 @@
                 <w:rFonts w:ascii="Calibri" w:hAnsi="Calibri" w:cs="Calibri"/>
                 <w:sz w:val="16"/>
                 <w:szCs w:val="16"/>
-                <w:lang w:eastAsia="en-NL"/>
+                <w:lang/>
               </w:rPr>
             </w:pPr>
             <w:r>
@@ -2331,7 +2363,7 @@
                 <w:rFonts w:ascii="Calibri" w:hAnsi="Calibri" w:cs="Calibri"/>
                 <w:sz w:val="16"/>
                 <w:szCs w:val="16"/>
-                <w:lang w:eastAsia="en-NL"/>
+                <w:lang/>
               </w:rPr>
               <w:t>1</w:t>
             </w:r>
@@ -2351,7 +2383,7 @@
                 <w:rFonts w:ascii="Calibri" w:hAnsi="Calibri" w:cs="Calibri"/>
                 <w:sz w:val="16"/>
                 <w:szCs w:val="16"/>
-                <w:lang w:eastAsia="en-NL"/>
+                <w:lang/>
               </w:rPr>
             </w:pPr>
             <w:r>
@@ -2359,7 +2391,7 @@
                 <w:rFonts w:ascii="Calibri" w:hAnsi="Calibri" w:cs="Calibri"/>
                 <w:sz w:val="16"/>
                 <w:szCs w:val="16"/>
-                <w:lang w:eastAsia="en-NL"/>
+                <w:lang/>
               </w:rPr>
               <w:t>1/1/2000</w:t>
             </w:r>
@@ -2379,7 +2411,7 @@
                 <w:rFonts w:ascii="Calibri" w:hAnsi="Calibri" w:cs="Calibri"/>
                 <w:sz w:val="16"/>
                 <w:szCs w:val="16"/>
-                <w:lang w:eastAsia="en-NL"/>
+                <w:lang/>
               </w:rPr>
             </w:pPr>
             <w:r>
@@ -2387,7 +2419,7 @@
                 <w:rFonts w:ascii="Calibri" w:hAnsi="Calibri" w:cs="Calibri"/>
                 <w:sz w:val="16"/>
                 <w:szCs w:val="16"/>
-                <w:lang w:eastAsia="en-NL"/>
+                <w:lang/>
               </w:rPr>
               <w:t>12/31/2017</w:t>
             </w:r>
@@ -2404,7 +2436,7 @@
                 <w:rFonts w:ascii="Calibri" w:hAnsi="Calibri" w:cs="Calibri"/>
                 <w:sz w:val="16"/>
                 <w:szCs w:val="16"/>
-                <w:lang w:eastAsia="en-NL"/>
+                <w:lang/>
               </w:rPr>
             </w:pPr>
             <w:r>
@@ -2412,7 +2444,7 @@
                 <w:rFonts w:ascii="Calibri" w:hAnsi="Calibri" w:cs="Calibri"/>
                 <w:sz w:val="16"/>
                 <w:szCs w:val="16"/>
-                <w:lang w:eastAsia="en-NL"/>
+                <w:lang/>
               </w:rPr>
               <w:t>LS</w:t>
             </w:r>
@@ -2435,7 +2467,7 @@
                 <w:rFonts w:ascii="Calibri" w:hAnsi="Calibri" w:cs="Calibri"/>
                 <w:sz w:val="16"/>
                 <w:szCs w:val="16"/>
-                <w:lang w:eastAsia="en-NL"/>
+                <w:lang/>
               </w:rPr>
             </w:pPr>
             <w:r>
@@ -2443,7 +2475,7 @@
                 <w:rFonts w:ascii="Calibri" w:hAnsi="Calibri" w:cs="Calibri"/>
                 <w:sz w:val="16"/>
                 <w:szCs w:val="16"/>
-                <w:lang w:eastAsia="en-NL"/>
+                <w:lang/>
               </w:rPr>
               <w:t>Seasonal forecast Rainfall and Temperature</w:t>
             </w:r>
@@ -2461,7 +2493,7 @@
                 <w:rFonts w:ascii="Calibri" w:hAnsi="Calibri" w:cs="Calibri"/>
                 <w:sz w:val="16"/>
                 <w:szCs w:val="16"/>
-                <w:lang w:eastAsia="en-NL"/>
+                <w:lang/>
               </w:rPr>
             </w:pPr>
             <w:proofErr w:type="spellStart"/>
@@ -2470,7 +2502,7 @@
                 <w:rFonts w:ascii="Calibri" w:hAnsi="Calibri" w:cs="Calibri"/>
                 <w:sz w:val="16"/>
                 <w:szCs w:val="16"/>
-                <w:lang w:eastAsia="en-NL"/>
+                <w:lang/>
               </w:rPr>
               <w:t>WeatherImpact</w:t>
             </w:r>
@@ -2480,7 +2512,7 @@
                 <w:rFonts w:ascii="Calibri" w:hAnsi="Calibri" w:cs="Calibri"/>
                 <w:sz w:val="16"/>
                 <w:szCs w:val="16"/>
-                <w:lang w:eastAsia="en-NL"/>
+                <w:lang/>
               </w:rPr>
               <w:t xml:space="preserve"> </w:t>
             </w:r>
@@ -2498,7 +2530,7 @@
                 <w:rFonts w:ascii="Calibri" w:hAnsi="Calibri" w:cs="Calibri"/>
                 <w:sz w:val="16"/>
                 <w:szCs w:val="16"/>
-                <w:lang w:eastAsia="en-NL"/>
+                <w:lang/>
               </w:rPr>
             </w:pPr>
             <w:r>
@@ -2506,7 +2538,7 @@
                 <w:rFonts w:ascii="Calibri" w:hAnsi="Calibri" w:cs="Calibri"/>
                 <w:sz w:val="16"/>
                 <w:szCs w:val="16"/>
-                <w:lang w:eastAsia="en-NL"/>
+                <w:lang/>
               </w:rPr>
               <w:t>API</w:t>
             </w:r>
@@ -2524,7 +2556,7 @@
                 <w:rFonts w:ascii="Calibri" w:hAnsi="Calibri" w:cs="Calibri"/>
                 <w:sz w:val="16"/>
                 <w:szCs w:val="16"/>
-                <w:lang w:eastAsia="en-NL"/>
+                <w:lang/>
               </w:rPr>
             </w:pPr>
             <w:r>
@@ -2532,7 +2564,7 @@
                 <w:rFonts w:ascii="Calibri" w:hAnsi="Calibri" w:cs="Calibri"/>
                 <w:sz w:val="16"/>
                 <w:szCs w:val="16"/>
-                <w:lang w:eastAsia="en-NL"/>
+                <w:lang/>
               </w:rPr>
               <w:t>9000</w:t>
             </w:r>
@@ -2550,7 +2582,7 @@
                 <w:rFonts w:ascii="Calibri" w:hAnsi="Calibri" w:cs="Calibri"/>
                 <w:sz w:val="16"/>
                 <w:szCs w:val="16"/>
-                <w:lang w:eastAsia="en-NL"/>
+                <w:lang/>
               </w:rPr>
             </w:pPr>
             <w:r>
@@ -2558,7 +2590,7 @@
                 <w:rFonts w:ascii="Calibri" w:hAnsi="Calibri" w:cs="Calibri"/>
                 <w:sz w:val="16"/>
                 <w:szCs w:val="16"/>
-                <w:lang w:eastAsia="en-NL"/>
+                <w:lang/>
               </w:rPr>
               <w:t>Monthly max, min, med of average value</w:t>
             </w:r>
@@ -2576,7 +2608,7 @@
                 <w:rFonts w:ascii="Calibri" w:hAnsi="Calibri" w:cs="Calibri"/>
                 <w:sz w:val="16"/>
                 <w:szCs w:val="16"/>
-                <w:lang w:eastAsia="en-NL"/>
+                <w:lang/>
               </w:rPr>
             </w:pPr>
             <w:r>
@@ -2584,7 +2616,7 @@
                 <w:rFonts w:ascii="Calibri" w:hAnsi="Calibri" w:cs="Calibri"/>
                 <w:sz w:val="16"/>
                 <w:szCs w:val="16"/>
-                <w:lang w:eastAsia="en-NL"/>
+                <w:lang/>
               </w:rPr>
               <w:t>Every month</w:t>
             </w:r>
@@ -2602,7 +2634,7 @@
                 <w:rFonts w:ascii="Calibri" w:hAnsi="Calibri" w:cs="Calibri"/>
                 <w:sz w:val="16"/>
                 <w:szCs w:val="16"/>
-                <w:lang w:eastAsia="en-NL"/>
+                <w:lang/>
               </w:rPr>
             </w:pPr>
             <w:r>
@@ -2610,7 +2642,7 @@
                 <w:rFonts w:ascii="Calibri" w:hAnsi="Calibri" w:cs="Calibri"/>
                 <w:sz w:val="16"/>
                 <w:szCs w:val="16"/>
-                <w:lang w:eastAsia="en-NL"/>
+                <w:lang/>
               </w:rPr>
               <w:t>5 months ahead</w:t>
             </w:r>
@@ -2627,7 +2659,7 @@
                 <w:rFonts w:ascii="Calibri" w:hAnsi="Calibri" w:cs="Calibri"/>
                 <w:sz w:val="16"/>
                 <w:szCs w:val="16"/>
-                <w:lang w:eastAsia="en-NL"/>
+                <w:lang/>
               </w:rPr>
             </w:pPr>
             <w:r>
@@ -2635,7 +2667,7 @@
                 <w:rFonts w:ascii="Calibri" w:hAnsi="Calibri" w:cs="Calibri"/>
                 <w:sz w:val="16"/>
                 <w:szCs w:val="16"/>
-                <w:lang w:eastAsia="en-NL"/>
+                <w:lang/>
               </w:rPr>
               <w:t>Seasonal Forecast</w:t>
             </w:r>
@@ -2654,6 +2686,7 @@
     <w:p>
       <w:pPr>
         <w:pStyle w:val="Heading3"/>
+        <w:ind w:left="1440" w:hanging="1440"/>
         <w:rPr>
           <w:lang w:val="en-GB"/>
         </w:rPr>
@@ -2812,7 +2845,7 @@
                 <w:rFonts w:ascii="Calibri" w:hAnsi="Calibri" w:cs="Calibri"/>
                 <w:sz w:val="16"/>
                 <w:szCs w:val="16"/>
-                <w:lang w:eastAsia="en-NL"/>
+                <w:lang/>
               </w:rPr>
             </w:pPr>
             <w:r>
@@ -2820,7 +2853,7 @@
                 <w:rFonts w:ascii="Calibri" w:hAnsi="Calibri" w:cs="Calibri"/>
                 <w:sz w:val="16"/>
                 <w:szCs w:val="16"/>
-                <w:lang w:eastAsia="en-NL"/>
+                <w:lang/>
               </w:rPr>
               <w:t>Parameter</w:t>
             </w:r>
@@ -2839,7 +2872,7 @@
                 <w:rFonts w:ascii="Calibri" w:hAnsi="Calibri" w:cs="Calibri"/>
                 <w:sz w:val="16"/>
                 <w:szCs w:val="16"/>
-                <w:lang w:eastAsia="en-NL"/>
+                <w:lang/>
               </w:rPr>
             </w:pPr>
             <w:r>
@@ -2847,7 +2880,7 @@
                 <w:rFonts w:ascii="Calibri" w:hAnsi="Calibri" w:cs="Calibri"/>
                 <w:sz w:val="16"/>
                 <w:szCs w:val="16"/>
-                <w:lang w:eastAsia="en-NL"/>
+                <w:lang/>
               </w:rPr>
               <w:t>Source</w:t>
             </w:r>
@@ -2867,7 +2900,7 @@
                 <w:b w:val="0"/>
                 <w:sz w:val="16"/>
                 <w:szCs w:val="16"/>
-                <w:lang w:eastAsia="en-NL"/>
+                <w:lang/>
               </w:rPr>
             </w:pPr>
             <w:r>
@@ -2875,7 +2908,7 @@
                 <w:rFonts w:ascii="Calibri" w:hAnsi="Calibri" w:cs="Calibri"/>
                 <w:sz w:val="16"/>
                 <w:szCs w:val="16"/>
-                <w:lang w:eastAsia="en-NL"/>
+                <w:lang/>
               </w:rPr>
               <w:t>Value</w:t>
             </w:r>
@@ -2887,7 +2920,7 @@
                 <w:rFonts w:ascii="Calibri" w:hAnsi="Calibri" w:cs="Calibri"/>
                 <w:sz w:val="16"/>
                 <w:szCs w:val="16"/>
-                <w:lang w:eastAsia="en-NL"/>
+                <w:lang/>
               </w:rPr>
             </w:pPr>
             <w:r>
@@ -2895,7 +2928,7 @@
                 <w:rFonts w:ascii="Calibri" w:hAnsi="Calibri" w:cs="Calibri"/>
                 <w:sz w:val="16"/>
                 <w:szCs w:val="16"/>
-                <w:lang w:eastAsia="en-NL"/>
+                <w:lang/>
               </w:rPr>
               <w:t>[m]</w:t>
             </w:r>
@@ -2919,7 +2952,7 @@
                 <w:rFonts w:ascii="Calibri" w:hAnsi="Calibri" w:cs="Calibri"/>
                 <w:sz w:val="16"/>
                 <w:szCs w:val="16"/>
-                <w:lang w:eastAsia="en-NL"/>
+                <w:lang/>
               </w:rPr>
             </w:pPr>
             <w:r>
@@ -2927,7 +2960,7 @@
                 <w:rFonts w:ascii="Calibri" w:hAnsi="Calibri" w:cs="Calibri"/>
                 <w:sz w:val="16"/>
                 <w:szCs w:val="16"/>
-                <w:lang w:eastAsia="en-NL"/>
+                <w:lang/>
               </w:rPr>
               <w:t>Kc</w:t>
             </w:r>
@@ -2946,7 +2979,7 @@
                 <w:rFonts w:ascii="Calibri" w:hAnsi="Calibri" w:cs="Calibri"/>
                 <w:sz w:val="16"/>
                 <w:szCs w:val="16"/>
-                <w:lang w:eastAsia="en-NL"/>
+                <w:lang/>
               </w:rPr>
             </w:pPr>
             <w:r>
@@ -2954,7 +2987,7 @@
                 <w:rFonts w:ascii="Calibri" w:hAnsi="Calibri" w:cs="Calibri"/>
                 <w:sz w:val="16"/>
                 <w:szCs w:val="16"/>
-                <w:lang w:eastAsia="en-NL"/>
+                <w:lang/>
               </w:rPr>
               <w:t xml:space="preserve">FAO/expert knowledge </w:t>
             </w:r>
@@ -2963,7 +2996,7 @@
                 <w:rFonts w:ascii="Calibri" w:hAnsi="Calibri" w:cs="Calibri"/>
                 <w:sz w:val="16"/>
                 <w:szCs w:val="16"/>
-                <w:lang w:eastAsia="en-NL"/>
+                <w:lang/>
               </w:rPr>
               <w:t>(</w:t>
             </w:r>
@@ -2972,7 +3005,7 @@
                 <w:rFonts w:ascii="Calibri" w:hAnsi="Calibri" w:cs="Calibri"/>
                 <w:sz w:val="16"/>
                 <w:szCs w:val="16"/>
-                <w:lang w:eastAsia="en-NL"/>
+                <w:lang/>
               </w:rPr>
               <w:t>Alex</w:t>
             </w:r>
@@ -2981,7 +3014,7 @@
                 <w:rFonts w:ascii="Calibri" w:hAnsi="Calibri" w:cs="Calibri"/>
                 <w:sz w:val="16"/>
                 <w:szCs w:val="16"/>
-                <w:lang w:eastAsia="en-NL"/>
+                <w:lang/>
               </w:rPr>
               <w:t xml:space="preserve"> Kaune)</w:t>
             </w:r>
@@ -3001,7 +3034,7 @@
                 <w:rFonts w:ascii="Calibri" w:hAnsi="Calibri" w:cs="Calibri"/>
                 <w:sz w:val="16"/>
                 <w:szCs w:val="16"/>
-                <w:lang w:eastAsia="en-NL"/>
+                <w:lang/>
               </w:rPr>
             </w:pPr>
           </w:p>
@@ -3024,7 +3057,7 @@
                 <w:rFonts w:ascii="Calibri" w:hAnsi="Calibri" w:cs="Calibri"/>
                 <w:sz w:val="16"/>
                 <w:szCs w:val="16"/>
-                <w:lang w:eastAsia="en-NL"/>
+                <w:lang/>
               </w:rPr>
             </w:pPr>
             <w:r>
@@ -3032,7 +3065,7 @@
                 <w:rFonts w:ascii="Calibri" w:hAnsi="Calibri" w:cs="Calibri"/>
                 <w:sz w:val="16"/>
                 <w:szCs w:val="16"/>
-                <w:lang w:eastAsia="en-NL"/>
+                <w:lang/>
               </w:rPr>
               <w:t>Lapse rate Temperature</w:t>
             </w:r>
@@ -3051,7 +3084,7 @@
                 <w:rFonts w:ascii="Calibri" w:hAnsi="Calibri" w:cs="Calibri"/>
                 <w:sz w:val="16"/>
                 <w:szCs w:val="16"/>
-                <w:lang w:eastAsia="en-NL"/>
+                <w:lang/>
               </w:rPr>
             </w:pPr>
             <w:r>
@@ -3059,7 +3092,7 @@
                 <w:rFonts w:ascii="Calibri" w:hAnsi="Calibri" w:cs="Calibri"/>
                 <w:sz w:val="16"/>
                 <w:szCs w:val="16"/>
-                <w:lang w:eastAsia="en-NL"/>
+                <w:lang/>
               </w:rPr>
               <w:t>Other projects</w:t>
             </w:r>
@@ -3079,7 +3112,7 @@
                 <w:rFonts w:ascii="Calibri" w:hAnsi="Calibri" w:cs="Calibri"/>
                 <w:sz w:val="16"/>
                 <w:szCs w:val="16"/>
-                <w:lang w:eastAsia="en-NL"/>
+                <w:lang/>
               </w:rPr>
             </w:pPr>
             <w:r>
@@ -3087,7 +3120,7 @@
                 <w:rFonts w:ascii="Calibri" w:hAnsi="Calibri" w:cs="Calibri"/>
                 <w:sz w:val="16"/>
                 <w:szCs w:val="16"/>
-                <w:lang w:eastAsia="en-NL"/>
+                <w:lang/>
               </w:rPr>
               <w:t>-0.065 ®C/m</w:t>
             </w:r>
@@ -3110,7 +3143,7 @@
                 <w:rFonts w:ascii="Calibri" w:hAnsi="Calibri" w:cs="Calibri"/>
                 <w:sz w:val="16"/>
                 <w:szCs w:val="16"/>
-                <w:lang w:eastAsia="en-NL"/>
+                <w:lang/>
               </w:rPr>
             </w:pPr>
             <w:r>
@@ -3118,7 +3151,7 @@
                 <w:rFonts w:ascii="Calibri" w:hAnsi="Calibri" w:cs="Calibri"/>
                 <w:sz w:val="16"/>
                 <w:szCs w:val="16"/>
-                <w:lang w:eastAsia="en-NL"/>
+                <w:lang/>
               </w:rPr>
               <w:lastRenderedPageBreak/>
               <w:t>Cropping calendar</w:t>
@@ -3137,7 +3170,7 @@
                 <w:rFonts w:ascii="Calibri" w:hAnsi="Calibri" w:cs="Calibri"/>
                 <w:sz w:val="16"/>
                 <w:szCs w:val="16"/>
-                <w:lang w:eastAsia="en-NL"/>
+                <w:lang/>
               </w:rPr>
             </w:pPr>
             <w:r>
@@ -3145,7 +3178,7 @@
                 <w:rFonts w:ascii="Calibri" w:hAnsi="Calibri" w:cs="Calibri"/>
                 <w:sz w:val="16"/>
                 <w:szCs w:val="16"/>
-                <w:lang w:eastAsia="en-NL"/>
+                <w:lang/>
               </w:rPr>
               <w:t>Local knowledge (Matteo Tonini)</w:t>
             </w:r>
@@ -3164,7 +3197,7 @@
                 <w:rFonts w:ascii="Calibri" w:hAnsi="Calibri" w:cs="Calibri"/>
                 <w:sz w:val="16"/>
                 <w:szCs w:val="16"/>
-                <w:lang w:eastAsia="en-NL"/>
+                <w:lang/>
               </w:rPr>
             </w:pPr>
           </w:p>
@@ -3248,41 +3281,25 @@
           <w:bCs/>
           <w:lang w:val="en-GB"/>
         </w:rPr>
-        <w:t>“</w:t>
-      </w:r>
+        <w:t>“G:\</w:t>
+      </w:r>
+      <w:proofErr w:type="spellStart"/>
       <w:r>
         <w:rPr>
           <w:b/>
           <w:bCs/>
           <w:lang w:val="en-GB"/>
         </w:rPr>
-        <w:t>G:\</w:t>
-      </w:r>
-      <w:proofErr w:type="spellStart"/>
+        <w:t>MavoDiamiPortals</w:t>
+      </w:r>
+      <w:proofErr w:type="spellEnd"/>
       <w:r>
         <w:rPr>
           <w:b/>
           <w:bCs/>
           <w:lang w:val="en-GB"/>
         </w:rPr>
-        <w:t>MavoDiamiPortals</w:t>
-      </w:r>
-      <w:proofErr w:type="spellEnd"/>
-      <w:r>
-        <w:rPr>
-          <w:b/>
-          <w:bCs/>
-          <w:lang w:val="en-GB"/>
-        </w:rPr>
-        <w:t>\Dropbox (FutureWater)\FW_VH-RK</w:t>
-      </w:r>
-      <w:r>
-        <w:rPr>
-          <w:b/>
-          <w:bCs/>
-          <w:lang w:val="en-GB"/>
-        </w:rPr>
-        <w:t>”</w:t>
+        <w:t>\Dropbox (FutureWater)\FW_VH-RK”</w:t>
       </w:r>
     </w:p>
     <w:p>
@@ -3495,6 +3512,7 @@
       </w:pPr>
       <w:r>
         <w:rPr>
+          <w:noProof/>
           <w:lang w:val="en-GB"/>
         </w:rPr>
         <w:drawing>
@@ -3569,6 +3587,7 @@
       </w:pPr>
       <w:r>
         <w:rPr>
+          <w:noProof/>
           <w:lang w:val="en-GB"/>
         </w:rPr>
         <w:drawing>
@@ -3653,6 +3672,7 @@
       </w:pPr>
       <w:r>
         <w:rPr>
+          <w:noProof/>
           <w:lang w:val="en-GB"/>
         </w:rPr>
         <w:drawing>
@@ -3719,6 +3739,7 @@
       </w:pPr>
       <w:r>
         <w:rPr>
+          <w:noProof/>
           <w:lang w:val="en-GB"/>
         </w:rPr>
         <w:lastRenderedPageBreak/>
@@ -3802,6 +3823,7 @@
       </w:pPr>
       <w:r>
         <w:rPr>
+          <w:noProof/>
           <w:lang w:val="en-GB"/>
         </w:rPr>
         <w:drawing>
@@ -4947,19 +4969,7 @@
         <w:rPr>
           <w:lang w:val="en-GB"/>
         </w:rPr>
-        <w:t>To only run scripts 0</w:t>
-      </w:r>
-      <w:r>
-        <w:rPr>
-          <w:lang w:val="en-GB"/>
-        </w:rPr>
-        <w:t>5</w:t>
-      </w:r>
-      <w:r>
-        <w:rPr>
-          <w:lang w:val="en-GB"/>
-        </w:rPr>
-        <w:t xml:space="preserve">, set the “switch” parameter in </w:t>
+        <w:t xml:space="preserve">To only run scripts 05, set the “switch” parameter in </w:t>
       </w:r>
       <w:r>
         <w:rPr>
@@ -4973,19 +4983,7 @@
         <w:rPr>
           <w:lang w:val="en-GB"/>
         </w:rPr>
-        <w:t xml:space="preserve"> to </w:t>
-      </w:r>
-      <w:r>
-        <w:rPr>
-          <w:lang w:val="en-GB"/>
-        </w:rPr>
-        <w:t>2</w:t>
-      </w:r>
-      <w:r>
-        <w:rPr>
-          <w:lang w:val="en-GB"/>
-        </w:rPr>
-        <w:t xml:space="preserve"> and run this script. </w:t>
+        <w:t xml:space="preserve"> to 2 and run this script. </w:t>
       </w:r>
     </w:p>
     <w:p>
@@ -5007,8 +5005,12 @@
       </w:r>
     </w:p>
     <w:sectPr>
-      <w:footerReference w:type="default" r:id="rId22"/>
-      <w:footerReference w:type="first" r:id="rId23"/>
+      <w:headerReference w:type="even" r:id="rId22"/>
+      <w:headerReference w:type="default" r:id="rId23"/>
+      <w:footerReference w:type="even" r:id="rId24"/>
+      <w:footerReference w:type="default" r:id="rId25"/>
+      <w:headerReference w:type="first" r:id="rId26"/>
+      <w:footerReference w:type="first" r:id="rId27"/>
       <w:footnotePr>
         <w:numRestart w:val="eachPage"/>
       </w:footnotePr>
@@ -5022,7 +5024,7 @@
 </file>
 
 <file path=word/endnotes.xml><?xml version="1.0" encoding="utf-8"?>
-<w:endnotes xmlns:wpc="http://schemas.microsoft.com/office/word/2010/wordprocessingCanvas" xmlns:cx="http://schemas.microsoft.com/office/drawing/2014/chartex" xmlns:cx1="http://schemas.microsoft.com/office/drawing/2015/9/8/chartex" xmlns:cx2="http://schemas.microsoft.com/office/drawing/2015/10/21/chartex" xmlns:cx3="http://schemas.microsoft.com/office/drawing/2016/5/9/chartex" xmlns:cx4="http://schemas.microsoft.com/office/drawing/2016/5/10/chartex" xmlns:cx5="http://schemas.microsoft.com/office/drawing/2016/5/11/chartex" xmlns:cx6="http://schemas.microsoft.com/office/drawing/2016/5/12/chartex" xmlns:cx7="http://schemas.microsoft.com/office/drawing/2016/5/13/chartex" xmlns:cx8="http://schemas.microsoft.com/office/drawing/2016/5/14/chartex" xmlns:mc="http://schemas.openxmlformats.org/markup-compatibility/2006" xmlns:aink="http://schemas.microsoft.com/office/drawing/2016/ink" xmlns:am3d="http://schemas.microsoft.com/office/drawing/2017/model3d" xmlns:o="urn:schemas-microsoft-com:office:office" xmlns:r="http://schemas.openxmlformats.org/officeDocument/2006/relationships" xmlns:m="http://schemas.openxmlformats.org/officeDocument/2006/math" xmlns:v="urn:schemas-microsoft-com:vml" xmlns:wp14="http://schemas.microsoft.com/office/word/2010/wordprocessingDrawing" xmlns:wp="http://schemas.openxmlformats.org/drawingml/2006/wordprocessingDrawing" xmlns:w10="urn:schemas-microsoft-com:office:word" xmlns:w="http://schemas.openxmlformats.org/wordprocessingml/2006/main" xmlns:w14="http://schemas.microsoft.com/office/word/2010/wordml" xmlns:w15="http://schemas.microsoft.com/office/word/2012/wordml" xmlns:w16cex="http://schemas.microsoft.com/office/word/2018/wordml/cex" xmlns:w16cid="http://schemas.microsoft.com/office/word/2016/wordml/cid" xmlns:w16="http://schemas.microsoft.com/office/word/2018/wordml" xmlns:w16sdtdh="http://schemas.microsoft.com/office/word/2020/wordml/sdtdatahash" xmlns:w16se="http://schemas.microsoft.com/office/word/2015/wordml/symex" xmlns:wpg="http://schemas.microsoft.com/office/word/2010/wordprocessingGroup" xmlns:wpi="http://schemas.microsoft.com/office/word/2010/wordprocessingInk" xmlns:wne="http://schemas.microsoft.com/office/word/2006/wordml" xmlns:wps="http://schemas.microsoft.com/office/word/2010/wordprocessingShape" mc:Ignorable="w14 w15 w16se w16cid w16 w16cex w16sdtdh wp14">
+<w:endnotes xmlns:wpc="http://schemas.microsoft.com/office/word/2010/wordprocessingCanvas" xmlns:cx="http://schemas.microsoft.com/office/drawing/2014/chartex" xmlns:cx1="http://schemas.microsoft.com/office/drawing/2015/9/8/chartex" xmlns:cx2="http://schemas.microsoft.com/office/drawing/2015/10/21/chartex" xmlns:cx3="http://schemas.microsoft.com/office/drawing/2016/5/9/chartex" xmlns:cx4="http://schemas.microsoft.com/office/drawing/2016/5/10/chartex" xmlns:cx5="http://schemas.microsoft.com/office/drawing/2016/5/11/chartex" xmlns:cx6="http://schemas.microsoft.com/office/drawing/2016/5/12/chartex" xmlns:cx7="http://schemas.microsoft.com/office/drawing/2016/5/13/chartex" xmlns:cx8="http://schemas.microsoft.com/office/drawing/2016/5/14/chartex" xmlns:mc="http://schemas.openxmlformats.org/markup-compatibility/2006" xmlns:aink="http://schemas.microsoft.com/office/drawing/2016/ink" xmlns:am3d="http://schemas.microsoft.com/office/drawing/2017/model3d" xmlns:o="urn:schemas-microsoft-com:office:office" xmlns:oel="http://schemas.microsoft.com/office/2019/extlst" xmlns:r="http://schemas.openxmlformats.org/officeDocument/2006/relationships" xmlns:m="http://schemas.openxmlformats.org/officeDocument/2006/math" xmlns:v="urn:schemas-microsoft-com:vml" xmlns:wp14="http://schemas.microsoft.com/office/word/2010/wordprocessingDrawing" xmlns:wp="http://schemas.openxmlformats.org/drawingml/2006/wordprocessingDrawing" xmlns:w10="urn:schemas-microsoft-com:office:word" xmlns:w="http://schemas.openxmlformats.org/wordprocessingml/2006/main" xmlns:w14="http://schemas.microsoft.com/office/word/2010/wordml" xmlns:w15="http://schemas.microsoft.com/office/word/2012/wordml" xmlns:w16cex="http://schemas.microsoft.com/office/word/2018/wordml/cex" xmlns:w16cid="http://schemas.microsoft.com/office/word/2016/wordml/cid" xmlns:w16="http://schemas.microsoft.com/office/word/2018/wordml" xmlns:w16du="http://schemas.microsoft.com/office/word/2023/wordml/word16du" xmlns:w16sdtdh="http://schemas.microsoft.com/office/word/2020/wordml/sdtdatahash" xmlns:w16sdtfl="http://schemas.microsoft.com/office/word/2024/wordml/sdtformatlock" xmlns:w16se="http://schemas.microsoft.com/office/word/2015/wordml/symex" xmlns:wpg="http://schemas.microsoft.com/office/word/2010/wordprocessingGroup" xmlns:wpi="http://schemas.microsoft.com/office/word/2010/wordprocessingInk" xmlns:wne="http://schemas.microsoft.com/office/word/2006/wordml" xmlns:wps="http://schemas.microsoft.com/office/word/2010/wordprocessingShape" mc:Ignorable="w14 w15 w16se w16cid w16 w16cex w16sdtdh w16sdtfl w16du wp14">
   <w:endnote w:type="separator" w:id="-1">
     <w:p>
       <w:r>
@@ -5041,7 +5043,17 @@
 </file>
 
 <file path=word/footer1.xml><?xml version="1.0" encoding="utf-8"?>
-<w:ftr xmlns:wpc="http://schemas.microsoft.com/office/word/2010/wordprocessingCanvas" xmlns:cx="http://schemas.microsoft.com/office/drawing/2014/chartex" xmlns:cx1="http://schemas.microsoft.com/office/drawing/2015/9/8/chartex" xmlns:cx2="http://schemas.microsoft.com/office/drawing/2015/10/21/chartex" xmlns:cx3="http://schemas.microsoft.com/office/drawing/2016/5/9/chartex" xmlns:cx4="http://schemas.microsoft.com/office/drawing/2016/5/10/chartex" xmlns:cx5="http://schemas.microsoft.com/office/drawing/2016/5/11/chartex" xmlns:cx6="http://schemas.microsoft.com/office/drawing/2016/5/12/chartex" xmlns:cx7="http://schemas.microsoft.com/office/drawing/2016/5/13/chartex" xmlns:cx8="http://schemas.microsoft.com/office/drawing/2016/5/14/chartex" xmlns:mc="http://schemas.openxmlformats.org/markup-compatibility/2006" xmlns:aink="http://schemas.microsoft.com/office/drawing/2016/ink" xmlns:am3d="http://schemas.microsoft.com/office/drawing/2017/model3d" xmlns:o="urn:schemas-microsoft-com:office:office" xmlns:r="http://schemas.openxmlformats.org/officeDocument/2006/relationships" xmlns:m="http://schemas.openxmlformats.org/officeDocument/2006/math" xmlns:v="urn:schemas-microsoft-com:vml" xmlns:wp14="http://schemas.microsoft.com/office/word/2010/wordprocessingDrawing" xmlns:wp="http://schemas.openxmlformats.org/drawingml/2006/wordprocessingDrawing" xmlns:w10="urn:schemas-microsoft-com:office:word" xmlns:w="http://schemas.openxmlformats.org/wordprocessingml/2006/main" xmlns:w14="http://schemas.microsoft.com/office/word/2010/wordml" xmlns:w15="http://schemas.microsoft.com/office/word/2012/wordml" xmlns:w16cex="http://schemas.microsoft.com/office/word/2018/wordml/cex" xmlns:w16cid="http://schemas.microsoft.com/office/word/2016/wordml/cid" xmlns:w16="http://schemas.microsoft.com/office/word/2018/wordml" xmlns:w16sdtdh="http://schemas.microsoft.com/office/word/2020/wordml/sdtdatahash" xmlns:w16se="http://schemas.microsoft.com/office/word/2015/wordml/symex" xmlns:wpg="http://schemas.microsoft.com/office/word/2010/wordprocessingGroup" xmlns:wpi="http://schemas.microsoft.com/office/word/2010/wordprocessingInk" xmlns:wne="http://schemas.microsoft.com/office/word/2006/wordml" xmlns:wps="http://schemas.microsoft.com/office/word/2010/wordprocessingShape" mc:Ignorable="w14 w15 w16se w16cid w16 w16cex w16sdtdh wp14">
+<w:ftr xmlns:wpc="http://schemas.microsoft.com/office/word/2010/wordprocessingCanvas" xmlns:cx="http://schemas.microsoft.com/office/drawing/2014/chartex" xmlns:cx1="http://schemas.microsoft.com/office/drawing/2015/9/8/chartex" xmlns:cx2="http://schemas.microsoft.com/office/drawing/2015/10/21/chartex" xmlns:cx3="http://schemas.microsoft.com/office/drawing/2016/5/9/chartex" xmlns:cx4="http://schemas.microsoft.com/office/drawing/2016/5/10/chartex" xmlns:cx5="http://schemas.microsoft.com/office/drawing/2016/5/11/chartex" xmlns:cx6="http://schemas.microsoft.com/office/drawing/2016/5/12/chartex" xmlns:cx7="http://schemas.microsoft.com/office/drawing/2016/5/13/chartex" xmlns:cx8="http://schemas.microsoft.com/office/drawing/2016/5/14/chartex" xmlns:mc="http://schemas.openxmlformats.org/markup-compatibility/2006" xmlns:aink="http://schemas.microsoft.com/office/drawing/2016/ink" xmlns:am3d="http://schemas.microsoft.com/office/drawing/2017/model3d" xmlns:o="urn:schemas-microsoft-com:office:office" xmlns:oel="http://schemas.microsoft.com/office/2019/extlst" xmlns:r="http://schemas.openxmlformats.org/officeDocument/2006/relationships" xmlns:m="http://schemas.openxmlformats.org/officeDocument/2006/math" xmlns:v="urn:schemas-microsoft-com:vml" xmlns:wp14="http://schemas.microsoft.com/office/word/2010/wordprocessingDrawing" xmlns:wp="http://schemas.openxmlformats.org/drawingml/2006/wordprocessingDrawing" xmlns:w10="urn:schemas-microsoft-com:office:word" xmlns:w="http://schemas.openxmlformats.org/wordprocessingml/2006/main" xmlns:w14="http://schemas.microsoft.com/office/word/2010/wordml" xmlns:w15="http://schemas.microsoft.com/office/word/2012/wordml" xmlns:w16cex="http://schemas.microsoft.com/office/word/2018/wordml/cex" xmlns:w16cid="http://schemas.microsoft.com/office/word/2016/wordml/cid" xmlns:w16="http://schemas.microsoft.com/office/word/2018/wordml" xmlns:w16du="http://schemas.microsoft.com/office/word/2023/wordml/word16du" xmlns:w16sdtdh="http://schemas.microsoft.com/office/word/2020/wordml/sdtdatahash" xmlns:w16sdtfl="http://schemas.microsoft.com/office/word/2024/wordml/sdtformatlock" xmlns:w16se="http://schemas.microsoft.com/office/word/2015/wordml/symex" xmlns:wpg="http://schemas.microsoft.com/office/word/2010/wordprocessingGroup" xmlns:wpi="http://schemas.microsoft.com/office/word/2010/wordprocessingInk" xmlns:wne="http://schemas.microsoft.com/office/word/2006/wordml" xmlns:wps="http://schemas.microsoft.com/office/word/2010/wordprocessingShape" mc:Ignorable="w14 w15 w16se w16cid w16 w16cex w16sdtdh w16sdtfl w16du wp14">
+  <w:p>
+    <w:pPr>
+      <w:pStyle w:val="Footer"/>
+    </w:pPr>
+  </w:p>
+</w:ftr>
+</file>
+
+<file path=word/footer2.xml><?xml version="1.0" encoding="utf-8"?>
+<w:ftr xmlns:wpc="http://schemas.microsoft.com/office/word/2010/wordprocessingCanvas" xmlns:cx="http://schemas.microsoft.com/office/drawing/2014/chartex" xmlns:cx1="http://schemas.microsoft.com/office/drawing/2015/9/8/chartex" xmlns:cx2="http://schemas.microsoft.com/office/drawing/2015/10/21/chartex" xmlns:cx3="http://schemas.microsoft.com/office/drawing/2016/5/9/chartex" xmlns:cx4="http://schemas.microsoft.com/office/drawing/2016/5/10/chartex" xmlns:cx5="http://schemas.microsoft.com/office/drawing/2016/5/11/chartex" xmlns:cx6="http://schemas.microsoft.com/office/drawing/2016/5/12/chartex" xmlns:cx7="http://schemas.microsoft.com/office/drawing/2016/5/13/chartex" xmlns:cx8="http://schemas.microsoft.com/office/drawing/2016/5/14/chartex" xmlns:mc="http://schemas.openxmlformats.org/markup-compatibility/2006" xmlns:aink="http://schemas.microsoft.com/office/drawing/2016/ink" xmlns:am3d="http://schemas.microsoft.com/office/drawing/2017/model3d" xmlns:o="urn:schemas-microsoft-com:office:office" xmlns:oel="http://schemas.microsoft.com/office/2019/extlst" xmlns:r="http://schemas.openxmlformats.org/officeDocument/2006/relationships" xmlns:m="http://schemas.openxmlformats.org/officeDocument/2006/math" xmlns:v="urn:schemas-microsoft-com:vml" xmlns:wp14="http://schemas.microsoft.com/office/word/2010/wordprocessingDrawing" xmlns:wp="http://schemas.openxmlformats.org/drawingml/2006/wordprocessingDrawing" xmlns:w10="urn:schemas-microsoft-com:office:word" xmlns:w="http://schemas.openxmlformats.org/wordprocessingml/2006/main" xmlns:w14="http://schemas.microsoft.com/office/word/2010/wordml" xmlns:w15="http://schemas.microsoft.com/office/word/2012/wordml" xmlns:w16cex="http://schemas.microsoft.com/office/word/2018/wordml/cex" xmlns:w16cid="http://schemas.microsoft.com/office/word/2016/wordml/cid" xmlns:w16="http://schemas.microsoft.com/office/word/2018/wordml" xmlns:w16du="http://schemas.microsoft.com/office/word/2023/wordml/word16du" xmlns:w16sdtdh="http://schemas.microsoft.com/office/word/2020/wordml/sdtdatahash" xmlns:w16sdtfl="http://schemas.microsoft.com/office/word/2024/wordml/sdtformatlock" xmlns:w16se="http://schemas.microsoft.com/office/word/2015/wordml/symex" xmlns:wpg="http://schemas.microsoft.com/office/word/2010/wordprocessingGroup" xmlns:wpi="http://schemas.microsoft.com/office/word/2010/wordprocessingInk" xmlns:wne="http://schemas.microsoft.com/office/word/2006/wordml" xmlns:wps="http://schemas.microsoft.com/office/word/2010/wordprocessingShape" mc:Ignorable="w14 w15 w16se w16cid w16 w16cex w16sdtdh w16sdtfl w16du wp14">
   <w:p>
     <w:pPr>
       <w:pStyle w:val="Footer"/>
@@ -5254,8 +5266,8 @@
 </w:ftr>
 </file>
 
-<file path=word/footer2.xml><?xml version="1.0" encoding="utf-8"?>
-<w:ftr xmlns:wpc="http://schemas.microsoft.com/office/word/2010/wordprocessingCanvas" xmlns:cx="http://schemas.microsoft.com/office/drawing/2014/chartex" xmlns:cx1="http://schemas.microsoft.com/office/drawing/2015/9/8/chartex" xmlns:cx2="http://schemas.microsoft.com/office/drawing/2015/10/21/chartex" xmlns:cx3="http://schemas.microsoft.com/office/drawing/2016/5/9/chartex" xmlns:cx4="http://schemas.microsoft.com/office/drawing/2016/5/10/chartex" xmlns:cx5="http://schemas.microsoft.com/office/drawing/2016/5/11/chartex" xmlns:cx6="http://schemas.microsoft.com/office/drawing/2016/5/12/chartex" xmlns:cx7="http://schemas.microsoft.com/office/drawing/2016/5/13/chartex" xmlns:cx8="http://schemas.microsoft.com/office/drawing/2016/5/14/chartex" xmlns:mc="http://schemas.openxmlformats.org/markup-compatibility/2006" xmlns:aink="http://schemas.microsoft.com/office/drawing/2016/ink" xmlns:am3d="http://schemas.microsoft.com/office/drawing/2017/model3d" xmlns:o="urn:schemas-microsoft-com:office:office" xmlns:r="http://schemas.openxmlformats.org/officeDocument/2006/relationships" xmlns:m="http://schemas.openxmlformats.org/officeDocument/2006/math" xmlns:v="urn:schemas-microsoft-com:vml" xmlns:wp14="http://schemas.microsoft.com/office/word/2010/wordprocessingDrawing" xmlns:wp="http://schemas.openxmlformats.org/drawingml/2006/wordprocessingDrawing" xmlns:w10="urn:schemas-microsoft-com:office:word" xmlns:w="http://schemas.openxmlformats.org/wordprocessingml/2006/main" xmlns:w14="http://schemas.microsoft.com/office/word/2010/wordml" xmlns:w15="http://schemas.microsoft.com/office/word/2012/wordml" xmlns:w16cex="http://schemas.microsoft.com/office/word/2018/wordml/cex" xmlns:w16cid="http://schemas.microsoft.com/office/word/2016/wordml/cid" xmlns:w16="http://schemas.microsoft.com/office/word/2018/wordml" xmlns:w16sdtdh="http://schemas.microsoft.com/office/word/2020/wordml/sdtdatahash" xmlns:w16se="http://schemas.microsoft.com/office/word/2015/wordml/symex" xmlns:wpg="http://schemas.microsoft.com/office/word/2010/wordprocessingGroup" xmlns:wpi="http://schemas.microsoft.com/office/word/2010/wordprocessingInk" xmlns:wne="http://schemas.microsoft.com/office/word/2006/wordml" xmlns:wps="http://schemas.microsoft.com/office/word/2010/wordprocessingShape" mc:Ignorable="w14 w15 w16se w16cid w16 w16cex w16sdtdh wp14">
+<file path=word/footer3.xml><?xml version="1.0" encoding="utf-8"?>
+<w:ftr xmlns:wpc="http://schemas.microsoft.com/office/word/2010/wordprocessingCanvas" xmlns:cx="http://schemas.microsoft.com/office/drawing/2014/chartex" xmlns:cx1="http://schemas.microsoft.com/office/drawing/2015/9/8/chartex" xmlns:cx2="http://schemas.microsoft.com/office/drawing/2015/10/21/chartex" xmlns:cx3="http://schemas.microsoft.com/office/drawing/2016/5/9/chartex" xmlns:cx4="http://schemas.microsoft.com/office/drawing/2016/5/10/chartex" xmlns:cx5="http://schemas.microsoft.com/office/drawing/2016/5/11/chartex" xmlns:cx6="http://schemas.microsoft.com/office/drawing/2016/5/12/chartex" xmlns:cx7="http://schemas.microsoft.com/office/drawing/2016/5/13/chartex" xmlns:cx8="http://schemas.microsoft.com/office/drawing/2016/5/14/chartex" xmlns:mc="http://schemas.openxmlformats.org/markup-compatibility/2006" xmlns:aink="http://schemas.microsoft.com/office/drawing/2016/ink" xmlns:am3d="http://schemas.microsoft.com/office/drawing/2017/model3d" xmlns:o="urn:schemas-microsoft-com:office:office" xmlns:oel="http://schemas.microsoft.com/office/2019/extlst" xmlns:r="http://schemas.openxmlformats.org/officeDocument/2006/relationships" xmlns:m="http://schemas.openxmlformats.org/officeDocument/2006/math" xmlns:v="urn:schemas-microsoft-com:vml" xmlns:wp14="http://schemas.microsoft.com/office/word/2010/wordprocessingDrawing" xmlns:wp="http://schemas.openxmlformats.org/drawingml/2006/wordprocessingDrawing" xmlns:w10="urn:schemas-microsoft-com:office:word" xmlns:w="http://schemas.openxmlformats.org/wordprocessingml/2006/main" xmlns:w14="http://schemas.microsoft.com/office/word/2010/wordml" xmlns:w15="http://schemas.microsoft.com/office/word/2012/wordml" xmlns:w16cex="http://schemas.microsoft.com/office/word/2018/wordml/cex" xmlns:w16cid="http://schemas.microsoft.com/office/word/2016/wordml/cid" xmlns:w16="http://schemas.microsoft.com/office/word/2018/wordml" xmlns:w16du="http://schemas.microsoft.com/office/word/2023/wordml/word16du" xmlns:w16sdtdh="http://schemas.microsoft.com/office/word/2020/wordml/sdtdatahash" xmlns:w16sdtfl="http://schemas.microsoft.com/office/word/2024/wordml/sdtformatlock" xmlns:w16se="http://schemas.microsoft.com/office/word/2015/wordml/symex" xmlns:wpg="http://schemas.microsoft.com/office/word/2010/wordprocessingGroup" xmlns:wpi="http://schemas.microsoft.com/office/word/2010/wordprocessingInk" xmlns:wne="http://schemas.microsoft.com/office/word/2006/wordml" xmlns:wps="http://schemas.microsoft.com/office/word/2010/wordprocessingShape" mc:Ignorable="w14 w15 w16se w16cid w16 w16cex w16sdtdh w16sdtfl w16du wp14">
   <w:p>
     <w:pPr>
       <w:pStyle w:val="Footer"/>
@@ -5385,7 +5397,7 @@
 </file>
 
 <file path=word/footnotes.xml><?xml version="1.0" encoding="utf-8"?>
-<w:footnotes xmlns:wpc="http://schemas.microsoft.com/office/word/2010/wordprocessingCanvas" xmlns:cx="http://schemas.microsoft.com/office/drawing/2014/chartex" xmlns:cx1="http://schemas.microsoft.com/office/drawing/2015/9/8/chartex" xmlns:cx2="http://schemas.microsoft.com/office/drawing/2015/10/21/chartex" xmlns:cx3="http://schemas.microsoft.com/office/drawing/2016/5/9/chartex" xmlns:cx4="http://schemas.microsoft.com/office/drawing/2016/5/10/chartex" xmlns:cx5="http://schemas.microsoft.com/office/drawing/2016/5/11/chartex" xmlns:cx6="http://schemas.microsoft.com/office/drawing/2016/5/12/chartex" xmlns:cx7="http://schemas.microsoft.com/office/drawing/2016/5/13/chartex" xmlns:cx8="http://schemas.microsoft.com/office/drawing/2016/5/14/chartex" xmlns:mc="http://schemas.openxmlformats.org/markup-compatibility/2006" xmlns:aink="http://schemas.microsoft.com/office/drawing/2016/ink" xmlns:am3d="http://schemas.microsoft.com/office/drawing/2017/model3d" xmlns:o="urn:schemas-microsoft-com:office:office" xmlns:r="http://schemas.openxmlformats.org/officeDocument/2006/relationships" xmlns:m="http://schemas.openxmlformats.org/officeDocument/2006/math" xmlns:v="urn:schemas-microsoft-com:vml" xmlns:wp14="http://schemas.microsoft.com/office/word/2010/wordprocessingDrawing" xmlns:wp="http://schemas.openxmlformats.org/drawingml/2006/wordprocessingDrawing" xmlns:w10="urn:schemas-microsoft-com:office:word" xmlns:w="http://schemas.openxmlformats.org/wordprocessingml/2006/main" xmlns:w14="http://schemas.microsoft.com/office/word/2010/wordml" xmlns:w15="http://schemas.microsoft.com/office/word/2012/wordml" xmlns:w16cex="http://schemas.microsoft.com/office/word/2018/wordml/cex" xmlns:w16cid="http://schemas.microsoft.com/office/word/2016/wordml/cid" xmlns:w16="http://schemas.microsoft.com/office/word/2018/wordml" xmlns:w16sdtdh="http://schemas.microsoft.com/office/word/2020/wordml/sdtdatahash" xmlns:w16se="http://schemas.microsoft.com/office/word/2015/wordml/symex" xmlns:wpg="http://schemas.microsoft.com/office/word/2010/wordprocessingGroup" xmlns:wpi="http://schemas.microsoft.com/office/word/2010/wordprocessingInk" xmlns:wne="http://schemas.microsoft.com/office/word/2006/wordml" xmlns:wps="http://schemas.microsoft.com/office/word/2010/wordprocessingShape" mc:Ignorable="w14 w15 w16se w16cid w16 w16cex w16sdtdh wp14">
+<w:footnotes xmlns:wpc="http://schemas.microsoft.com/office/word/2010/wordprocessingCanvas" xmlns:cx="http://schemas.microsoft.com/office/drawing/2014/chartex" xmlns:cx1="http://schemas.microsoft.com/office/drawing/2015/9/8/chartex" xmlns:cx2="http://schemas.microsoft.com/office/drawing/2015/10/21/chartex" xmlns:cx3="http://schemas.microsoft.com/office/drawing/2016/5/9/chartex" xmlns:cx4="http://schemas.microsoft.com/office/drawing/2016/5/10/chartex" xmlns:cx5="http://schemas.microsoft.com/office/drawing/2016/5/11/chartex" xmlns:cx6="http://schemas.microsoft.com/office/drawing/2016/5/12/chartex" xmlns:cx7="http://schemas.microsoft.com/office/drawing/2016/5/13/chartex" xmlns:cx8="http://schemas.microsoft.com/office/drawing/2016/5/14/chartex" xmlns:mc="http://schemas.openxmlformats.org/markup-compatibility/2006" xmlns:aink="http://schemas.microsoft.com/office/drawing/2016/ink" xmlns:am3d="http://schemas.microsoft.com/office/drawing/2017/model3d" xmlns:o="urn:schemas-microsoft-com:office:office" xmlns:oel="http://schemas.microsoft.com/office/2019/extlst" xmlns:r="http://schemas.openxmlformats.org/officeDocument/2006/relationships" xmlns:m="http://schemas.openxmlformats.org/officeDocument/2006/math" xmlns:v="urn:schemas-microsoft-com:vml" xmlns:wp14="http://schemas.microsoft.com/office/word/2010/wordprocessingDrawing" xmlns:wp="http://schemas.openxmlformats.org/drawingml/2006/wordprocessingDrawing" xmlns:w10="urn:schemas-microsoft-com:office:word" xmlns:w="http://schemas.openxmlformats.org/wordprocessingml/2006/main" xmlns:w14="http://schemas.microsoft.com/office/word/2010/wordml" xmlns:w15="http://schemas.microsoft.com/office/word/2012/wordml" xmlns:w16cex="http://schemas.microsoft.com/office/word/2018/wordml/cex" xmlns:w16cid="http://schemas.microsoft.com/office/word/2016/wordml/cid" xmlns:w16="http://schemas.microsoft.com/office/word/2018/wordml" xmlns:w16du="http://schemas.microsoft.com/office/word/2023/wordml/word16du" xmlns:w16sdtdh="http://schemas.microsoft.com/office/word/2020/wordml/sdtdatahash" xmlns:w16sdtfl="http://schemas.microsoft.com/office/word/2024/wordml/sdtformatlock" xmlns:w16se="http://schemas.microsoft.com/office/word/2015/wordml/symex" xmlns:wpg="http://schemas.microsoft.com/office/word/2010/wordprocessingGroup" xmlns:wpi="http://schemas.microsoft.com/office/word/2010/wordprocessingInk" xmlns:wne="http://schemas.microsoft.com/office/word/2006/wordml" xmlns:wps="http://schemas.microsoft.com/office/word/2010/wordprocessingShape" mc:Ignorable="w14 w15 w16se w16cid w16 w16cex w16sdtdh w16sdtfl w16du wp14">
   <w:footnote w:type="separator" w:id="-1">
     <w:p>
       <w:r>
@@ -5403,8 +5415,38 @@
 </w:footnotes>
 </file>
 
+<file path=word/header1.xml><?xml version="1.0" encoding="utf-8"?>
+<w:hdr xmlns:wpc="http://schemas.microsoft.com/office/word/2010/wordprocessingCanvas" xmlns:cx="http://schemas.microsoft.com/office/drawing/2014/chartex" xmlns:cx1="http://schemas.microsoft.com/office/drawing/2015/9/8/chartex" xmlns:cx2="http://schemas.microsoft.com/office/drawing/2015/10/21/chartex" xmlns:cx3="http://schemas.microsoft.com/office/drawing/2016/5/9/chartex" xmlns:cx4="http://schemas.microsoft.com/office/drawing/2016/5/10/chartex" xmlns:cx5="http://schemas.microsoft.com/office/drawing/2016/5/11/chartex" xmlns:cx6="http://schemas.microsoft.com/office/drawing/2016/5/12/chartex" xmlns:cx7="http://schemas.microsoft.com/office/drawing/2016/5/13/chartex" xmlns:cx8="http://schemas.microsoft.com/office/drawing/2016/5/14/chartex" xmlns:mc="http://schemas.openxmlformats.org/markup-compatibility/2006" xmlns:aink="http://schemas.microsoft.com/office/drawing/2016/ink" xmlns:am3d="http://schemas.microsoft.com/office/drawing/2017/model3d" xmlns:o="urn:schemas-microsoft-com:office:office" xmlns:oel="http://schemas.microsoft.com/office/2019/extlst" xmlns:r="http://schemas.openxmlformats.org/officeDocument/2006/relationships" xmlns:m="http://schemas.openxmlformats.org/officeDocument/2006/math" xmlns:v="urn:schemas-microsoft-com:vml" xmlns:wp14="http://schemas.microsoft.com/office/word/2010/wordprocessingDrawing" xmlns:wp="http://schemas.openxmlformats.org/drawingml/2006/wordprocessingDrawing" xmlns:w10="urn:schemas-microsoft-com:office:word" xmlns:w="http://schemas.openxmlformats.org/wordprocessingml/2006/main" xmlns:w14="http://schemas.microsoft.com/office/word/2010/wordml" xmlns:w15="http://schemas.microsoft.com/office/word/2012/wordml" xmlns:w16cex="http://schemas.microsoft.com/office/word/2018/wordml/cex" xmlns:w16cid="http://schemas.microsoft.com/office/word/2016/wordml/cid" xmlns:w16="http://schemas.microsoft.com/office/word/2018/wordml" xmlns:w16du="http://schemas.microsoft.com/office/word/2023/wordml/word16du" xmlns:w16sdtdh="http://schemas.microsoft.com/office/word/2020/wordml/sdtdatahash" xmlns:w16sdtfl="http://schemas.microsoft.com/office/word/2024/wordml/sdtformatlock" xmlns:w16se="http://schemas.microsoft.com/office/word/2015/wordml/symex" xmlns:wpg="http://schemas.microsoft.com/office/word/2010/wordprocessingGroup" xmlns:wpi="http://schemas.microsoft.com/office/word/2010/wordprocessingInk" xmlns:wne="http://schemas.microsoft.com/office/word/2006/wordml" xmlns:wps="http://schemas.microsoft.com/office/word/2010/wordprocessingShape" mc:Ignorable="w14 w15 w16se w16cid w16 w16cex w16sdtdh w16sdtfl w16du wp14">
+  <w:p>
+    <w:pPr>
+      <w:pStyle w:val="Header"/>
+    </w:pPr>
+  </w:p>
+</w:hdr>
+</file>
+
+<file path=word/header2.xml><?xml version="1.0" encoding="utf-8"?>
+<w:hdr xmlns:wpc="http://schemas.microsoft.com/office/word/2010/wordprocessingCanvas" xmlns:cx="http://schemas.microsoft.com/office/drawing/2014/chartex" xmlns:cx1="http://schemas.microsoft.com/office/drawing/2015/9/8/chartex" xmlns:cx2="http://schemas.microsoft.com/office/drawing/2015/10/21/chartex" xmlns:cx3="http://schemas.microsoft.com/office/drawing/2016/5/9/chartex" xmlns:cx4="http://schemas.microsoft.com/office/drawing/2016/5/10/chartex" xmlns:cx5="http://schemas.microsoft.com/office/drawing/2016/5/11/chartex" xmlns:cx6="http://schemas.microsoft.com/office/drawing/2016/5/12/chartex" xmlns:cx7="http://schemas.microsoft.com/office/drawing/2016/5/13/chartex" xmlns:cx8="http://schemas.microsoft.com/office/drawing/2016/5/14/chartex" xmlns:mc="http://schemas.openxmlformats.org/markup-compatibility/2006" xmlns:aink="http://schemas.microsoft.com/office/drawing/2016/ink" xmlns:am3d="http://schemas.microsoft.com/office/drawing/2017/model3d" xmlns:o="urn:schemas-microsoft-com:office:office" xmlns:oel="http://schemas.microsoft.com/office/2019/extlst" xmlns:r="http://schemas.openxmlformats.org/officeDocument/2006/relationships" xmlns:m="http://schemas.openxmlformats.org/officeDocument/2006/math" xmlns:v="urn:schemas-microsoft-com:vml" xmlns:wp14="http://schemas.microsoft.com/office/word/2010/wordprocessingDrawing" xmlns:wp="http://schemas.openxmlformats.org/drawingml/2006/wordprocessingDrawing" xmlns:w10="urn:schemas-microsoft-com:office:word" xmlns:w="http://schemas.openxmlformats.org/wordprocessingml/2006/main" xmlns:w14="http://schemas.microsoft.com/office/word/2010/wordml" xmlns:w15="http://schemas.microsoft.com/office/word/2012/wordml" xmlns:w16cex="http://schemas.microsoft.com/office/word/2018/wordml/cex" xmlns:w16cid="http://schemas.microsoft.com/office/word/2016/wordml/cid" xmlns:w16="http://schemas.microsoft.com/office/word/2018/wordml" xmlns:w16du="http://schemas.microsoft.com/office/word/2023/wordml/word16du" xmlns:w16sdtdh="http://schemas.microsoft.com/office/word/2020/wordml/sdtdatahash" xmlns:w16sdtfl="http://schemas.microsoft.com/office/word/2024/wordml/sdtformatlock" xmlns:w16se="http://schemas.microsoft.com/office/word/2015/wordml/symex" xmlns:wpg="http://schemas.microsoft.com/office/word/2010/wordprocessingGroup" xmlns:wpi="http://schemas.microsoft.com/office/word/2010/wordprocessingInk" xmlns:wne="http://schemas.microsoft.com/office/word/2006/wordml" xmlns:wps="http://schemas.microsoft.com/office/word/2010/wordprocessingShape" mc:Ignorable="w14 w15 w16se w16cid w16 w16cex w16sdtdh w16sdtfl w16du wp14">
+  <w:p>
+    <w:pPr>
+      <w:pStyle w:val="Header"/>
+    </w:pPr>
+  </w:p>
+</w:hdr>
+</file>
+
+<file path=word/header3.xml><?xml version="1.0" encoding="utf-8"?>
+<w:hdr xmlns:wpc="http://schemas.microsoft.com/office/word/2010/wordprocessingCanvas" xmlns:cx="http://schemas.microsoft.com/office/drawing/2014/chartex" xmlns:cx1="http://schemas.microsoft.com/office/drawing/2015/9/8/chartex" xmlns:cx2="http://schemas.microsoft.com/office/drawing/2015/10/21/chartex" xmlns:cx3="http://schemas.microsoft.com/office/drawing/2016/5/9/chartex" xmlns:cx4="http://schemas.microsoft.com/office/drawing/2016/5/10/chartex" xmlns:cx5="http://schemas.microsoft.com/office/drawing/2016/5/11/chartex" xmlns:cx6="http://schemas.microsoft.com/office/drawing/2016/5/12/chartex" xmlns:cx7="http://schemas.microsoft.com/office/drawing/2016/5/13/chartex" xmlns:cx8="http://schemas.microsoft.com/office/drawing/2016/5/14/chartex" xmlns:mc="http://schemas.openxmlformats.org/markup-compatibility/2006" xmlns:aink="http://schemas.microsoft.com/office/drawing/2016/ink" xmlns:am3d="http://schemas.microsoft.com/office/drawing/2017/model3d" xmlns:o="urn:schemas-microsoft-com:office:office" xmlns:oel="http://schemas.microsoft.com/office/2019/extlst" xmlns:r="http://schemas.openxmlformats.org/officeDocument/2006/relationships" xmlns:m="http://schemas.openxmlformats.org/officeDocument/2006/math" xmlns:v="urn:schemas-microsoft-com:vml" xmlns:wp14="http://schemas.microsoft.com/office/word/2010/wordprocessingDrawing" xmlns:wp="http://schemas.openxmlformats.org/drawingml/2006/wordprocessingDrawing" xmlns:w10="urn:schemas-microsoft-com:office:word" xmlns:w="http://schemas.openxmlformats.org/wordprocessingml/2006/main" xmlns:w14="http://schemas.microsoft.com/office/word/2010/wordml" xmlns:w15="http://schemas.microsoft.com/office/word/2012/wordml" xmlns:w16cex="http://schemas.microsoft.com/office/word/2018/wordml/cex" xmlns:w16cid="http://schemas.microsoft.com/office/word/2016/wordml/cid" xmlns:w16="http://schemas.microsoft.com/office/word/2018/wordml" xmlns:w16du="http://schemas.microsoft.com/office/word/2023/wordml/word16du" xmlns:w16sdtdh="http://schemas.microsoft.com/office/word/2020/wordml/sdtdatahash" xmlns:w16sdtfl="http://schemas.microsoft.com/office/word/2024/wordml/sdtformatlock" xmlns:w16se="http://schemas.microsoft.com/office/word/2015/wordml/symex" xmlns:wpg="http://schemas.microsoft.com/office/word/2010/wordprocessingGroup" xmlns:wpi="http://schemas.microsoft.com/office/word/2010/wordprocessingInk" xmlns:wne="http://schemas.microsoft.com/office/word/2006/wordml" xmlns:wps="http://schemas.microsoft.com/office/word/2010/wordprocessingShape" mc:Ignorable="w14 w15 w16se w16cid w16 w16cex w16sdtdh w16sdtfl w16du wp14">
+  <w:p>
+    <w:pPr>
+      <w:pStyle w:val="Header"/>
+    </w:pPr>
+  </w:p>
+</w:hdr>
+</file>
+
 <file path=word/numbering.xml><?xml version="1.0" encoding="utf-8"?>
-<w:numbering xmlns:wpc="http://schemas.microsoft.com/office/word/2010/wordprocessingCanvas" xmlns:cx="http://schemas.microsoft.com/office/drawing/2014/chartex" xmlns:cx1="http://schemas.microsoft.com/office/drawing/2015/9/8/chartex" xmlns:cx2="http://schemas.microsoft.com/office/drawing/2015/10/21/chartex" xmlns:cx3="http://schemas.microsoft.com/office/drawing/2016/5/9/chartex" xmlns:cx4="http://schemas.microsoft.com/office/drawing/2016/5/10/chartex" xmlns:cx5="http://schemas.microsoft.com/office/drawing/2016/5/11/chartex" xmlns:cx6="http://schemas.microsoft.com/office/drawing/2016/5/12/chartex" xmlns:cx7="http://schemas.microsoft.com/office/drawing/2016/5/13/chartex" xmlns:cx8="http://schemas.microsoft.com/office/drawing/2016/5/14/chartex" xmlns:mc="http://schemas.openxmlformats.org/markup-compatibility/2006" xmlns:aink="http://schemas.microsoft.com/office/drawing/2016/ink" xmlns:am3d="http://schemas.microsoft.com/office/drawing/2017/model3d" xmlns:o="urn:schemas-microsoft-com:office:office" xmlns:r="http://schemas.openxmlformats.org/officeDocument/2006/relationships" xmlns:m="http://schemas.openxmlformats.org/officeDocument/2006/math" xmlns:v="urn:schemas-microsoft-com:vml" xmlns:wp14="http://schemas.microsoft.com/office/word/2010/wordprocessingDrawing" xmlns:wp="http://schemas.openxmlformats.org/drawingml/2006/wordprocessingDrawing" xmlns:w10="urn:schemas-microsoft-com:office:word" xmlns:w="http://schemas.openxmlformats.org/wordprocessingml/2006/main" xmlns:w14="http://schemas.microsoft.com/office/word/2010/wordml" xmlns:w15="http://schemas.microsoft.com/office/word/2012/wordml" xmlns:w16cex="http://schemas.microsoft.com/office/word/2018/wordml/cex" xmlns:w16cid="http://schemas.microsoft.com/office/word/2016/wordml/cid" xmlns:w16="http://schemas.microsoft.com/office/word/2018/wordml" xmlns:w16sdtdh="http://schemas.microsoft.com/office/word/2020/wordml/sdtdatahash" xmlns:w16se="http://schemas.microsoft.com/office/word/2015/wordml/symex" xmlns:wpg="http://schemas.microsoft.com/office/word/2010/wordprocessingGroup" xmlns:wpi="http://schemas.microsoft.com/office/word/2010/wordprocessingInk" xmlns:wne="http://schemas.microsoft.com/office/word/2006/wordml" xmlns:wps="http://schemas.microsoft.com/office/word/2010/wordprocessingShape" mc:Ignorable="w14 w15 w16se w16cid w16 w16cex w16sdtdh wp14">
+<w:numbering xmlns:wpc="http://schemas.microsoft.com/office/word/2010/wordprocessingCanvas" xmlns:cx="http://schemas.microsoft.com/office/drawing/2014/chartex" xmlns:cx1="http://schemas.microsoft.com/office/drawing/2015/9/8/chartex" xmlns:cx2="http://schemas.microsoft.com/office/drawing/2015/10/21/chartex" xmlns:cx3="http://schemas.microsoft.com/office/drawing/2016/5/9/chartex" xmlns:cx4="http://schemas.microsoft.com/office/drawing/2016/5/10/chartex" xmlns:cx5="http://schemas.microsoft.com/office/drawing/2016/5/11/chartex" xmlns:cx6="http://schemas.microsoft.com/office/drawing/2016/5/12/chartex" xmlns:cx7="http://schemas.microsoft.com/office/drawing/2016/5/13/chartex" xmlns:cx8="http://schemas.microsoft.com/office/drawing/2016/5/14/chartex" xmlns:mc="http://schemas.openxmlformats.org/markup-compatibility/2006" xmlns:aink="http://schemas.microsoft.com/office/drawing/2016/ink" xmlns:am3d="http://schemas.microsoft.com/office/drawing/2017/model3d" xmlns:o="urn:schemas-microsoft-com:office:office" xmlns:oel="http://schemas.microsoft.com/office/2019/extlst" xmlns:r="http://schemas.openxmlformats.org/officeDocument/2006/relationships" xmlns:m="http://schemas.openxmlformats.org/officeDocument/2006/math" xmlns:v="urn:schemas-microsoft-com:vml" xmlns:wp14="http://schemas.microsoft.com/office/word/2010/wordprocessingDrawing" xmlns:wp="http://schemas.openxmlformats.org/drawingml/2006/wordprocessingDrawing" xmlns:w10="urn:schemas-microsoft-com:office:word" xmlns:w="http://schemas.openxmlformats.org/wordprocessingml/2006/main" xmlns:w14="http://schemas.microsoft.com/office/word/2010/wordml" xmlns:w15="http://schemas.microsoft.com/office/word/2012/wordml" xmlns:w16cex="http://schemas.microsoft.com/office/word/2018/wordml/cex" xmlns:w16cid="http://schemas.microsoft.com/office/word/2016/wordml/cid" xmlns:w16="http://schemas.microsoft.com/office/word/2018/wordml" xmlns:w16du="http://schemas.microsoft.com/office/word/2023/wordml/word16du" xmlns:w16sdtdh="http://schemas.microsoft.com/office/word/2020/wordml/sdtdatahash" xmlns:w16sdtfl="http://schemas.microsoft.com/office/word/2024/wordml/sdtformatlock" xmlns:w16se="http://schemas.microsoft.com/office/word/2015/wordml/symex" xmlns:wpg="http://schemas.microsoft.com/office/word/2010/wordprocessingGroup" xmlns:wpi="http://schemas.microsoft.com/office/word/2010/wordprocessingInk" xmlns:wne="http://schemas.microsoft.com/office/word/2006/wordml" xmlns:wps="http://schemas.microsoft.com/office/word/2010/wordprocessingShape" mc:Ignorable="w14 w15 w16se w16cid w16 w16cex w16sdtdh w16sdtfl w16du wp14">
   <w:abstractNum w:abstractNumId="0" w15:restartNumberingAfterBreak="0">
     <w:nsid w:val="00000002"/>
     <w:multiLevelType w:val="singleLevel"/>
@@ -10518,136 +10560,136 @@
       </w:pPr>
     </w:lvl>
   </w:abstractNum>
-  <w:num w:numId="1">
+  <w:num w:numId="1" w16cid:durableId="353382621">
     <w:abstractNumId w:val="46"/>
   </w:num>
-  <w:num w:numId="2">
+  <w:num w:numId="2" w16cid:durableId="2074355772">
     <w:abstractNumId w:val="32"/>
   </w:num>
-  <w:num w:numId="3">
+  <w:num w:numId="3" w16cid:durableId="1556819796">
     <w:abstractNumId w:val="40"/>
   </w:num>
-  <w:num w:numId="4">
+  <w:num w:numId="4" w16cid:durableId="1181092437">
     <w:abstractNumId w:val="21"/>
   </w:num>
-  <w:num w:numId="5">
+  <w:num w:numId="5" w16cid:durableId="1849245611">
     <w:abstractNumId w:val="28"/>
   </w:num>
-  <w:num w:numId="6">
+  <w:num w:numId="6" w16cid:durableId="1002706115">
     <w:abstractNumId w:val="8"/>
   </w:num>
-  <w:num w:numId="7">
+  <w:num w:numId="7" w16cid:durableId="1168442648">
     <w:abstractNumId w:val="31"/>
   </w:num>
-  <w:num w:numId="8">
+  <w:num w:numId="8" w16cid:durableId="661356124">
     <w:abstractNumId w:val="27"/>
   </w:num>
-  <w:num w:numId="9">
+  <w:num w:numId="9" w16cid:durableId="906650498">
     <w:abstractNumId w:val="15"/>
   </w:num>
-  <w:num w:numId="10">
+  <w:num w:numId="10" w16cid:durableId="1281952714">
     <w:abstractNumId w:val="12"/>
   </w:num>
-  <w:num w:numId="11">
+  <w:num w:numId="11" w16cid:durableId="532577788">
     <w:abstractNumId w:val="44"/>
   </w:num>
-  <w:num w:numId="12">
+  <w:num w:numId="12" w16cid:durableId="1019507501">
     <w:abstractNumId w:val="13"/>
   </w:num>
-  <w:num w:numId="13">
+  <w:num w:numId="13" w16cid:durableId="844781836">
     <w:abstractNumId w:val="4"/>
   </w:num>
-  <w:num w:numId="14">
+  <w:num w:numId="14" w16cid:durableId="1450120845">
     <w:abstractNumId w:val="33"/>
   </w:num>
-  <w:num w:numId="15">
+  <w:num w:numId="15" w16cid:durableId="1619724874">
     <w:abstractNumId w:val="25"/>
   </w:num>
-  <w:num w:numId="16">
+  <w:num w:numId="16" w16cid:durableId="881551631">
     <w:abstractNumId w:val="23"/>
   </w:num>
-  <w:num w:numId="17">
+  <w:num w:numId="17" w16cid:durableId="358047000">
     <w:abstractNumId w:val="16"/>
   </w:num>
-  <w:num w:numId="18">
+  <w:num w:numId="18" w16cid:durableId="1186480631">
     <w:abstractNumId w:val="19"/>
   </w:num>
-  <w:num w:numId="19">
+  <w:num w:numId="19" w16cid:durableId="1400009060">
     <w:abstractNumId w:val="10"/>
   </w:num>
-  <w:num w:numId="20">
+  <w:num w:numId="20" w16cid:durableId="1190728038">
     <w:abstractNumId w:val="35"/>
   </w:num>
-  <w:num w:numId="21">
+  <w:num w:numId="21" w16cid:durableId="1133986600">
     <w:abstractNumId w:val="26"/>
   </w:num>
-  <w:num w:numId="22">
+  <w:num w:numId="22" w16cid:durableId="936521991">
     <w:abstractNumId w:val="39"/>
   </w:num>
-  <w:num w:numId="23">
+  <w:num w:numId="23" w16cid:durableId="81027735">
     <w:abstractNumId w:val="17"/>
   </w:num>
-  <w:num w:numId="24">
+  <w:num w:numId="24" w16cid:durableId="1129518281">
     <w:abstractNumId w:val="6"/>
   </w:num>
-  <w:num w:numId="25">
+  <w:num w:numId="25" w16cid:durableId="801263844">
     <w:abstractNumId w:val="20"/>
   </w:num>
-  <w:num w:numId="26">
+  <w:num w:numId="26" w16cid:durableId="546138648">
     <w:abstractNumId w:val="22"/>
   </w:num>
-  <w:num w:numId="27">
+  <w:num w:numId="27" w16cid:durableId="526329568">
     <w:abstractNumId w:val="29"/>
   </w:num>
-  <w:num w:numId="28">
+  <w:num w:numId="28" w16cid:durableId="824707443">
     <w:abstractNumId w:val="45"/>
   </w:num>
-  <w:num w:numId="29">
+  <w:num w:numId="29" w16cid:durableId="644509939">
     <w:abstractNumId w:val="38"/>
   </w:num>
-  <w:num w:numId="30">
+  <w:num w:numId="30" w16cid:durableId="507135026">
     <w:abstractNumId w:val="5"/>
   </w:num>
-  <w:num w:numId="31">
+  <w:num w:numId="31" w16cid:durableId="1894154197">
     <w:abstractNumId w:val="37"/>
   </w:num>
-  <w:num w:numId="32">
+  <w:num w:numId="32" w16cid:durableId="714617242">
     <w:abstractNumId w:val="24"/>
   </w:num>
-  <w:num w:numId="33">
+  <w:num w:numId="33" w16cid:durableId="1553152449">
     <w:abstractNumId w:val="14"/>
   </w:num>
-  <w:num w:numId="34">
+  <w:num w:numId="34" w16cid:durableId="859854089">
     <w:abstractNumId w:val="43"/>
   </w:num>
-  <w:num w:numId="35">
+  <w:num w:numId="35" w16cid:durableId="1682731561">
     <w:abstractNumId w:val="30"/>
   </w:num>
-  <w:num w:numId="36">
+  <w:num w:numId="36" w16cid:durableId="1069158002">
     <w:abstractNumId w:val="42"/>
   </w:num>
-  <w:num w:numId="37">
+  <w:num w:numId="37" w16cid:durableId="1419448752">
     <w:abstractNumId w:val="46"/>
   </w:num>
-  <w:num w:numId="38">
+  <w:num w:numId="38" w16cid:durableId="1121193418">
     <w:abstractNumId w:val="46"/>
   </w:num>
-  <w:num w:numId="39">
+  <w:num w:numId="39" w16cid:durableId="1348826481">
     <w:abstractNumId w:val="41"/>
   </w:num>
-  <w:num w:numId="40">
+  <w:num w:numId="40" w16cid:durableId="1933658497">
     <w:abstractNumId w:val="11"/>
   </w:num>
-  <w:num w:numId="41">
+  <w:num w:numId="41" w16cid:durableId="196240881">
     <w:abstractNumId w:val="34"/>
   </w:num>
-  <w:num w:numId="42">
+  <w:num w:numId="42" w16cid:durableId="1443450586">
     <w:abstractNumId w:val="36"/>
   </w:num>
-  <w:num w:numId="43">
+  <w:num w:numId="43" w16cid:durableId="704060414">
     <w:abstractNumId w:val="7"/>
   </w:num>
-  <w:num w:numId="44">
+  <w:num w:numId="44" w16cid:durableId="657078313">
     <w:abstractNumId w:val="9"/>
   </w:num>
   <w:numIdMacAtCleanup w:val="12"/>
@@ -10655,7 +10697,7 @@
 </file>
 
 <file path=word/styles.xml><?xml version="1.0" encoding="utf-8"?>
-<w:styles xmlns:mc="http://schemas.openxmlformats.org/markup-compatibility/2006" xmlns:r="http://schemas.openxmlformats.org/officeDocument/2006/relationships" xmlns:w="http://schemas.openxmlformats.org/wordprocessingml/2006/main" xmlns:w14="http://schemas.microsoft.com/office/word/2010/wordml" xmlns:w15="http://schemas.microsoft.com/office/word/2012/wordml" xmlns:w16cex="http://schemas.microsoft.com/office/word/2018/wordml/cex" xmlns:w16cid="http://schemas.microsoft.com/office/word/2016/wordml/cid" xmlns:w16="http://schemas.microsoft.com/office/word/2018/wordml" xmlns:w16sdtdh="http://schemas.microsoft.com/office/word/2020/wordml/sdtdatahash" xmlns:w16se="http://schemas.microsoft.com/office/word/2015/wordml/symex" mc:Ignorable="w14 w15 w16se w16cid w16 w16cex w16sdtdh">
+<w:styles xmlns:mc="http://schemas.openxmlformats.org/markup-compatibility/2006" xmlns:r="http://schemas.openxmlformats.org/officeDocument/2006/relationships" xmlns:w="http://schemas.openxmlformats.org/wordprocessingml/2006/main" xmlns:w14="http://schemas.microsoft.com/office/word/2010/wordml" xmlns:w15="http://schemas.microsoft.com/office/word/2012/wordml" xmlns:w16cex="http://schemas.microsoft.com/office/word/2018/wordml/cex" xmlns:w16cid="http://schemas.microsoft.com/office/word/2016/wordml/cid" xmlns:w16="http://schemas.microsoft.com/office/word/2018/wordml" xmlns:w16du="http://schemas.microsoft.com/office/word/2023/wordml/word16du" xmlns:w16sdtdh="http://schemas.microsoft.com/office/word/2020/wordml/sdtdatahash" xmlns:w16sdtfl="http://schemas.microsoft.com/office/word/2024/wordml/sdtformatlock" xmlns:w16se="http://schemas.microsoft.com/office/word/2015/wordml/symex" mc:Ignorable="w14 w15 w16se w16cid w16 w16cex w16sdtdh w16sdtfl w16du">
   <w:docDefaults>
     <w:rPrDefault>
       <w:rPr>
@@ -12551,15 +12593,6 @@
 </file>
 
 <file path=customXml/item1.xml><?xml version="1.0" encoding="utf-8"?>
-<?mso-contentType ?>
-<FormTemplates xmlns="http://schemas.microsoft.com/sharepoint/v3/contenttype/forms">
-  <Display>DocumentLibraryForm</Display>
-  <Edit>DocumentLibraryForm</Edit>
-  <New>DocumentLibraryForm</New>
-</FormTemplates>
-</file>
-
-<file path=customXml/item2.xml><?xml version="1.0" encoding="utf-8"?>
 <p:properties xmlns:p="http://schemas.microsoft.com/office/2006/metadata/properties" xmlns:xsi="http://www.w3.org/2001/XMLSchema-instance" xmlns:pc="http://schemas.microsoft.com/office/infopath/2007/PartnerControls">
   <documentManagement>
     <TaxCatchAll xmlns="0ec16f51-00dd-45ed-8a1e-5f4fb0df3a9e" xsi:nil="true"/>
@@ -12570,13 +12603,18 @@
 </p:properties>
 </file>
 
-<file path=customXml/item3.xml><?xml version="1.0" encoding="utf-8"?>
-<b:Sources xmlns:b="http://schemas.openxmlformats.org/officeDocument/2006/bibliography" xmlns="http://schemas.openxmlformats.org/officeDocument/2006/bibliography" SelectedStyle="\APA.XSL" StyleName="APA"/>
+<file path=customXml/item2.xml><?xml version="1.0" encoding="utf-8"?>
+<?mso-contentType ?>
+<FormTemplates xmlns="http://schemas.microsoft.com/sharepoint/v3/contenttype/forms">
+  <Display>DocumentLibraryForm</Display>
+  <Edit>DocumentLibraryForm</Edit>
+  <New>DocumentLibraryForm</New>
+</FormTemplates>
 </file>
 
-<file path=customXml/item4.xml><?xml version="1.0" encoding="utf-8"?>
-<ct:contentTypeSchema xmlns:ct="http://schemas.microsoft.com/office/2006/metadata/contentType" xmlns:ma="http://schemas.microsoft.com/office/2006/metadata/properties/metaAttributes" ct:_="" ma:_="" ma:contentTypeName="Document" ma:contentTypeID="0x0101002492F93491C1FE42B9FBAC81948501A9" ma:contentTypeVersion="18" ma:contentTypeDescription="Create a new document." ma:contentTypeScope="" ma:versionID="8d79b07c1638102670f3db10284f6b46">
-  <xsd:schema xmlns:xsd="http://www.w3.org/2001/XMLSchema" xmlns:xs="http://www.w3.org/2001/XMLSchema" xmlns:p="http://schemas.microsoft.com/office/2006/metadata/properties" xmlns:ns2="450daf11-1e42-4a2e-b9b4-7c771ac61d8f" xmlns:ns3="0ec16f51-00dd-45ed-8a1e-5f4fb0df3a9e" targetNamespace="http://schemas.microsoft.com/office/2006/metadata/properties" ma:root="true" ma:fieldsID="f4189338cd9931847c26fc53eda23bb0" ns2:_="" ns3:_="">
+<file path=customXml/item3.xml><?xml version="1.0" encoding="utf-8"?>
+<ct:contentTypeSchema xmlns:ct="http://schemas.microsoft.com/office/2006/metadata/contentType" xmlns:ma="http://schemas.microsoft.com/office/2006/metadata/properties/metaAttributes" ct:_="" ma:_="" ma:contentTypeName="Document" ma:contentTypeID="0x0101002492F93491C1FE42B9FBAC81948501A9" ma:contentTypeVersion="19" ma:contentTypeDescription="Create a new document." ma:contentTypeScope="" ma:versionID="6fb57b8d7ee27db0f0f7cb6d322032d0">
+  <xsd:schema xmlns:xsd="http://www.w3.org/2001/XMLSchema" xmlns:xs="http://www.w3.org/2001/XMLSchema" xmlns:p="http://schemas.microsoft.com/office/2006/metadata/properties" xmlns:ns2="450daf11-1e42-4a2e-b9b4-7c771ac61d8f" xmlns:ns3="0ec16f51-00dd-45ed-8a1e-5f4fb0df3a9e" targetNamespace="http://schemas.microsoft.com/office/2006/metadata/properties" ma:root="true" ma:fieldsID="7c757ba833c14f921b865de8b89cfb7c" ns2:_="" ns3:_="">
     <xsd:import namespace="450daf11-1e42-4a2e-b9b4-7c771ac61d8f"/>
     <xsd:import namespace="0ec16f51-00dd-45ed-8a1e-5f4fb0df3a9e"/>
     <xsd:element name="properties">
@@ -12602,6 +12640,7 @@
                 <xsd:element ref="ns3:TaxCatchAll" minOccurs="0"/>
                 <xsd:element ref="ns2:MediaServiceSearchProperties" minOccurs="0"/>
                 <xsd:element ref="ns2:MediaServiceObjectDetectorVersions" minOccurs="0"/>
+                <xsd:element ref="ns2:MediaServiceBillingMetadata" minOccurs="0"/>
               </xsd:all>
             </xsd:complexType>
           </xsd:element>
@@ -12686,6 +12725,11 @@
     <xsd:element name="MediaServiceObjectDetectorVersions" ma:index="25" nillable="true" ma:displayName="MediaServiceObjectDetectorVersions" ma:description="" ma:hidden="true" ma:indexed="true" ma:internalName="MediaServiceObjectDetectorVersions" ma:readOnly="true">
       <xsd:simpleType>
         <xsd:restriction base="dms:Text"/>
+      </xsd:simpleType>
+    </xsd:element>
+    <xsd:element name="MediaServiceBillingMetadata" ma:index="26" nillable="true" ma:displayName="MediaServiceBillingMetadata" ma:hidden="true" ma:internalName="MediaServiceBillingMetadata" ma:readOnly="true">
+      <xsd:simpleType>
+        <xsd:restriction base="dms:Note"/>
       </xsd:simpleType>
     </xsd:element>
   </xsd:schema>
@@ -12829,7 +12873,22 @@
 </ct:contentTypeSchema>
 </file>
 
+<file path=customXml/item4.xml><?xml version="1.0" encoding="utf-8"?>
+<b:Sources xmlns:b="http://schemas.openxmlformats.org/officeDocument/2006/bibliography" xmlns="http://schemas.openxmlformats.org/officeDocument/2006/bibliography" SelectedStyle="\APA.XSL" StyleName="APA"/>
+</file>
+
 <file path=customXml/itemProps1.xml><?xml version="1.0" encoding="utf-8"?>
+<ds:datastoreItem xmlns:ds="http://schemas.openxmlformats.org/officeDocument/2006/customXml" ds:itemID="{3420E34F-39E1-4414-A9A2-185FEA8B5593}">
+  <ds:schemaRefs>
+    <ds:schemaRef ds:uri="http://schemas.microsoft.com/office/2006/metadata/properties"/>
+    <ds:schemaRef ds:uri="http://schemas.microsoft.com/office/infopath/2007/PartnerControls"/>
+    <ds:schemaRef ds:uri="0ec16f51-00dd-45ed-8a1e-5f4fb0df3a9e"/>
+    <ds:schemaRef ds:uri="450daf11-1e42-4a2e-b9b4-7c771ac61d8f"/>
+  </ds:schemaRefs>
+</ds:datastoreItem>
+</file>
+
+<file path=customXml/itemProps2.xml><?xml version="1.0" encoding="utf-8"?>
 <ds:datastoreItem xmlns:ds="http://schemas.openxmlformats.org/officeDocument/2006/customXml" ds:itemID="{511D69D4-0F28-421C-AA67-32651A0CAFC7}">
   <ds:schemaRefs>
     <ds:schemaRef ds:uri="http://schemas.microsoft.com/sharepoint/v3/contenttype/forms"/>
@@ -12837,23 +12896,14 @@
 </ds:datastoreItem>
 </file>
 
-<file path=customXml/itemProps2.xml><?xml version="1.0" encoding="utf-8"?>
-<ds:datastoreItem xmlns:ds="http://schemas.openxmlformats.org/officeDocument/2006/customXml" ds:itemID="{3420E34F-39E1-4414-A9A2-185FEA8B5593}">
-  <ds:schemaRefs>
-    <ds:schemaRef ds:uri="http://schemas.microsoft.com/office/2006/metadata/properties"/>
-    <ds:schemaRef ds:uri="http://schemas.microsoft.com/office/infopath/2007/PartnerControls"/>
-  </ds:schemaRefs>
-</ds:datastoreItem>
+<file path=customXml/itemProps3.xml><?xml version="1.0" encoding="utf-8"?>
+<ds:datastoreItem xmlns:ds="http://schemas.openxmlformats.org/officeDocument/2006/customXml" ds:itemID="{B8B157EF-6A5D-4416-ABF4-D00B79D20017}"/>
 </file>
 
-<file path=customXml/itemProps3.xml><?xml version="1.0" encoding="utf-8"?>
+<file path=customXml/itemProps4.xml><?xml version="1.0" encoding="utf-8"?>
 <ds:datastoreItem xmlns:ds="http://schemas.openxmlformats.org/officeDocument/2006/customXml" ds:itemID="{481897D0-5752-406A-B9AD-4C8D9F4EEA0D}">
   <ds:schemaRefs>
     <ds:schemaRef ds:uri="http://schemas.openxmlformats.org/officeDocument/2006/bibliography"/>
   </ds:schemaRefs>
 </ds:datastoreItem>
-</file>
-
-<file path=customXml/itemProps4.xml><?xml version="1.0" encoding="utf-8"?>
-<ds:datastoreItem xmlns:ds="http://schemas.openxmlformats.org/officeDocument/2006/customXml" ds:itemID="{EF301090-3908-4986-985F-2F0F35C4FE65}"/>
 </file>
</xml_diff>